<commit_message>
Update on final thesis
</commit_message>
<xml_diff>
--- a/docs/thesis/diplomaDocumentAT_Final.docx
+++ b/docs/thesis/diplomaDocumentAT_Final.docx
@@ -7,14 +7,7 @@
         <w:pStyle w:val="Normal"/>
         <w:spacing w:lineRule="auto" w:line="360" w:before="120" w:after="120"/>
         <w:jc w:val="center"/>
-        <w:rPr>
-          <w:rFonts w:ascii="Times New Roman" w:hAnsi="Times New Roman" w:cs="Times New Roman"/>
-          <w:b/>
-          <w:bCs/>
-          <w:sz w:val="36"/>
-          <w:szCs w:val="36"/>
-          <w:lang w:val="en-US"/>
-        </w:rPr>
+        <w:rPr/>
       </w:pPr>
       <w:r>
         <w:rPr>
@@ -33,6 +26,25 @@
         <w:pStyle w:val="Normal"/>
         <w:spacing w:lineRule="auto" w:line="360"/>
         <w:jc w:val="center"/>
+        <w:rPr/>
+      </w:pPr>
+      <w:r>
+        <w:rPr>
+          <w:rFonts w:cs="Times New Roman"/>
+          <w:b/>
+          <w:bCs/>
+          <w:sz w:val="32"/>
+          <w:szCs w:val="32"/>
+          <w:lang w:val="en-US"/>
+        </w:rPr>
+        <w:t>FACULTY OF COMPUTER SYSTEMS AND TECHNOLOGIES</w:t>
+      </w:r>
+    </w:p>
+    <w:p>
+      <w:pPr>
+        <w:pStyle w:val="Normal"/>
+        <w:spacing w:lineRule="auto" w:line="360"/>
+        <w:jc w:val="center"/>
         <w:rPr>
           <w:rFonts w:ascii="Times New Roman" w:hAnsi="Times New Roman" w:cs="Times New Roman"/>
           <w:b/>
@@ -51,7 +63,6 @@
           <w:szCs w:val="32"/>
           <w:lang w:val="en-US"/>
         </w:rPr>
-        <w:t>FACULTY OF COMPUTER SYSTEMS AND TECHNOLOGIES</w:t>
       </w:r>
     </w:p>
     <w:p>
@@ -84,39 +95,7 @@
         <w:pStyle w:val="Normal"/>
         <w:spacing w:lineRule="auto" w:line="360"/>
         <w:jc w:val="center"/>
-        <w:rPr>
-          <w:rFonts w:ascii="Times New Roman" w:hAnsi="Times New Roman" w:cs="Times New Roman"/>
-          <w:b/>
-          <w:bCs/>
-          <w:sz w:val="32"/>
-          <w:szCs w:val="32"/>
-          <w:lang w:val="en-US"/>
-        </w:rPr>
-      </w:pPr>
-      <w:r>
-        <w:rPr>
-          <w:rFonts w:cs="Times New Roman"/>
-          <w:b/>
-          <w:bCs/>
-          <w:sz w:val="32"/>
-          <w:szCs w:val="32"/>
-          <w:lang w:val="en-US"/>
-        </w:rPr>
-      </w:r>
-    </w:p>
-    <w:p>
-      <w:pPr>
-        <w:pStyle w:val="Normal"/>
-        <w:spacing w:lineRule="auto" w:line="360"/>
-        <w:jc w:val="center"/>
-        <w:rPr>
-          <w:rFonts w:ascii="Times New Roman" w:hAnsi="Times New Roman" w:cs="Times New Roman"/>
-          <w:b/>
-          <w:bCs/>
-          <w:sz w:val="28"/>
-          <w:szCs w:val="28"/>
-          <w:lang w:val="en-US"/>
-        </w:rPr>
+        <w:rPr/>
       </w:pPr>
       <w:r>
         <w:rPr>
@@ -135,14 +114,7 @@
         <w:pStyle w:val="Normal"/>
         <w:spacing w:lineRule="auto" w:line="360"/>
         <w:jc w:val="center"/>
-        <w:rPr>
-          <w:rFonts w:ascii="Times New Roman" w:hAnsi="Times New Roman" w:cs="Times New Roman"/>
-          <w:b/>
-          <w:bCs/>
-          <w:sz w:val="40"/>
-          <w:szCs w:val="40"/>
-          <w:lang w:val="en-US"/>
-        </w:rPr>
+        <w:rPr/>
       </w:pPr>
       <w:r>
         <w:rPr>
@@ -180,14 +152,7 @@
         <w:pStyle w:val="Normal"/>
         <w:spacing w:lineRule="auto" w:line="360"/>
         <w:jc w:val="center"/>
-        <w:rPr>
-          <w:rFonts w:ascii="Times New Roman" w:hAnsi="Times New Roman" w:cs="Times New Roman"/>
-          <w:b/>
-          <w:bCs/>
-          <w:sz w:val="28"/>
-          <w:szCs w:val="28"/>
-          <w:lang w:val="en-US"/>
-        </w:rPr>
+        <w:rPr/>
       </w:pPr>
       <w:r>
         <mc:AlternateContent>
@@ -305,14 +270,7 @@
         <w:pStyle w:val="Normal"/>
         <w:spacing w:lineRule="auto" w:line="360"/>
         <w:jc w:val="center"/>
-        <w:rPr>
-          <w:rFonts w:ascii="Times New Roman" w:hAnsi="Times New Roman" w:cs="Times New Roman"/>
-          <w:b/>
-          <w:bCs/>
-          <w:sz w:val="28"/>
-          <w:szCs w:val="28"/>
-          <w:lang w:val="en-US"/>
-        </w:rPr>
+        <w:rPr/>
       </w:pPr>
       <w:r>
         <w:rPr>
@@ -755,7 +713,7 @@
               <w:rPr>
                 <w:rStyle w:val="IndexLink"/>
               </w:rPr>
-              <w:t>3.1 Centralized Scheduling</w:t>
+              <w:t>3.1. Centralized Scheduling</w:t>
               <w:tab/>
               <w:t>7</w:t>
             </w:r>
@@ -775,7 +733,7 @@
               <w:rPr>
                 <w:rStyle w:val="IndexLink"/>
               </w:rPr>
-              <w:t>3.2 Broker-Based Task Queues</w:t>
+              <w:t>3.2. Broker-Based Task Queues</w:t>
               <w:tab/>
               <w:t>8</w:t>
             </w:r>
@@ -795,7 +753,7 @@
               <w:rPr>
                 <w:rStyle w:val="IndexLink"/>
               </w:rPr>
-              <w:t>3.3 Database-Backed Task Queue</w:t>
+              <w:t>3.3. Database-Backed Task Queue</w:t>
               <w:tab/>
               <w:t>8</w:t>
             </w:r>
@@ -815,7 +773,7 @@
               <w:rPr>
                 <w:rStyle w:val="IndexLink"/>
               </w:rPr>
-              <w:t>3.4 Multi-Agent System Approach</w:t>
+              <w:t>3.4. Multi-Agent System Approach</w:t>
               <w:tab/>
               <w:t>9</w:t>
             </w:r>
@@ -835,7 +793,7 @@
               <w:rPr>
                 <w:rStyle w:val="IndexLink"/>
               </w:rPr>
-              <w:t>3.5 Comparative Summary</w:t>
+              <w:t>3.5. Comparative Summary</w:t>
               <w:tab/>
               <w:t>10</w:t>
             </w:r>
@@ -875,7 +833,7 @@
               <w:rPr>
                 <w:rStyle w:val="IndexLink"/>
               </w:rPr>
-              <w:t>4.1 Aim of the Thesis</w:t>
+              <w:t>4.1. Aim of the Thesis</w:t>
               <w:tab/>
               <w:t>11</w:t>
             </w:r>
@@ -895,7 +853,7 @@
               <w:rPr>
                 <w:rStyle w:val="IndexLink"/>
               </w:rPr>
-              <w:t>4.2 Main Development Tasks</w:t>
+              <w:t>4.2. Main Development Tasks</w:t>
               <w:tab/>
               <w:t>12</w:t>
             </w:r>
@@ -915,7 +873,7 @@
               <w:rPr>
                 <w:rStyle w:val="IndexLink"/>
               </w:rPr>
-              <w:t>4.3 Functional Requirements</w:t>
+              <w:t>4.3. Functional Requirements</w:t>
               <w:tab/>
               <w:t>13</w:t>
             </w:r>
@@ -935,7 +893,7 @@
               <w:rPr>
                 <w:rStyle w:val="IndexLink"/>
               </w:rPr>
-              <w:t>4.4 Non-Functional Requirements</w:t>
+              <w:t>4.4. Non-Functional Requirements</w:t>
               <w:tab/>
               <w:t>15</w:t>
             </w:r>
@@ -955,7 +913,7 @@
               <w:rPr>
                 <w:rStyle w:val="IndexLink"/>
               </w:rPr>
-              <w:t>4.5 Constraints and Out-of-Scope Features</w:t>
+              <w:t>4.5. Constraints and Out-of-Scope Features</w:t>
               <w:tab/>
               <w:t>16</w:t>
             </w:r>
@@ -995,7 +953,7 @@
               <w:rPr>
                 <w:rStyle w:val="IndexLink"/>
               </w:rPr>
-              <w:t>5.1 Java, JADE, and Maven</w:t>
+              <w:t>5.1. Java, JADE, and Maven</w:t>
               <w:tab/>
               <w:t>17</w:t>
             </w:r>
@@ -1015,7 +973,7 @@
               <w:rPr>
                 <w:rStyle w:val="IndexLink"/>
               </w:rPr>
-              <w:t>5.2 PostgreSQL and JDBC</w:t>
+              <w:t>5.2. PostgreSQL and JDBC</w:t>
               <w:tab/>
               <w:t>17</w:t>
             </w:r>
@@ -1035,7 +993,7 @@
               <w:rPr>
                 <w:rStyle w:val="IndexLink"/>
               </w:rPr>
-              <w:t>5.3 Python Task Modules</w:t>
+              <w:t>5.3. Python Task Modules</w:t>
               <w:tab/>
               <w:t>18</w:t>
             </w:r>
@@ -1055,7 +1013,7 @@
               <w:rPr>
                 <w:rStyle w:val="IndexLink"/>
               </w:rPr>
-              <w:t>5.4 SQLAlchemy and Database Access in Python</w:t>
+              <w:t>5.4. SQLAlchemy and Database Access in Python</w:t>
               <w:tab/>
               <w:t>19</w:t>
             </w:r>
@@ -1075,7 +1033,7 @@
               <w:rPr>
                 <w:rStyle w:val="IndexLink"/>
               </w:rPr>
-              <w:t>5.5 FastAPI, Jinja Templates, and the Web Dashboard</w:t>
+              <w:t>5.5. FastAPI, Jinja Templates, and the Web Dashboard</w:t>
               <w:tab/>
               <w:t>20</w:t>
             </w:r>
@@ -1095,7 +1053,7 @@
               <w:rPr>
                 <w:rStyle w:val="IndexLink"/>
               </w:rPr>
-              <w:t>5.6 Scripts, Configuration, and Testing Tools</w:t>
+              <w:t>5.6. Scripts, Configuration, and Testing Tools</w:t>
               <w:tab/>
               <w:t>20</w:t>
             </w:r>
@@ -1643,14 +1601,8 @@
         <w:bidi w:val="0"/>
         <w:spacing w:before="0" w:after="280"/>
         <w:ind w:hanging="0" w:left="0"/>
-        <w:jc w:val="left"/>
-        <w:rPr>
-          <w:rFonts w:ascii="Times New Roman" w:hAnsi="Times New Roman" w:cs="Times New Roman"/>
-          <w:b/>
-          <w:bCs/>
-          <w:szCs w:val="28"/>
-          <w:lang w:val="en-US"/>
-        </w:rPr>
+        <w:jc w:val="both"/>
+        <w:rPr/>
       </w:pPr>
       <w:bookmarkStart w:id="0" w:name="__RefHeading___Toc372_1229224459"/>
       <w:bookmarkEnd w:id="0"/>
@@ -1676,9 +1628,8 @@
         <w:pStyle w:val="Normal"/>
         <w:bidi w:val="0"/>
         <w:ind w:firstLine="850"/>
-        <w:rPr>
-          <w:rFonts w:ascii="Times New Roman" w:hAnsi="Times New Roman" w:cs="Times New Roman"/>
-        </w:rPr>
+        <w:jc w:val="both"/>
+        <w:rPr/>
       </w:pPr>
       <w:r>
         <w:rPr>
@@ -1692,9 +1643,8 @@
         <w:pStyle w:val="Normal"/>
         <w:bidi w:val="0"/>
         <w:ind w:firstLine="850"/>
-        <w:rPr>
-          <w:rFonts w:ascii="Times New Roman" w:hAnsi="Times New Roman" w:cs="Times New Roman"/>
-        </w:rPr>
+        <w:jc w:val="both"/>
+        <w:rPr/>
       </w:pPr>
       <w:r>
         <w:rPr>
@@ -1708,9 +1658,8 @@
         <w:pStyle w:val="Normal"/>
         <w:bidi w:val="0"/>
         <w:ind w:firstLine="850"/>
-        <w:rPr>
-          <w:rFonts w:ascii="Times New Roman" w:hAnsi="Times New Roman" w:cs="Times New Roman"/>
-        </w:rPr>
+        <w:jc w:val="both"/>
+        <w:rPr/>
       </w:pPr>
       <w:r>
         <w:rPr>
@@ -1724,9 +1673,8 @@
         <w:pStyle w:val="Normal"/>
         <w:bidi w:val="0"/>
         <w:ind w:firstLine="850"/>
-        <w:rPr>
-          <w:rFonts w:ascii="Times New Roman" w:hAnsi="Times New Roman" w:cs="Times New Roman"/>
-        </w:rPr>
+        <w:jc w:val="both"/>
+        <w:rPr/>
       </w:pPr>
       <w:r>
         <w:rPr>
@@ -1740,9 +1688,8 @@
         <w:pStyle w:val="Normal"/>
         <w:bidi w:val="0"/>
         <w:ind w:firstLine="850"/>
-        <w:rPr>
-          <w:rFonts w:ascii="Times New Roman" w:hAnsi="Times New Roman" w:cs="Times New Roman"/>
-        </w:rPr>
+        <w:jc w:val="both"/>
+        <w:rPr/>
       </w:pPr>
       <w:r>
         <w:rPr>
@@ -1756,9 +1703,8 @@
         <w:pStyle w:val="Normal"/>
         <w:bidi w:val="0"/>
         <w:ind w:firstLine="850"/>
-        <w:rPr>
-          <w:rFonts w:ascii="Times New Roman" w:hAnsi="Times New Roman" w:cs="Times New Roman"/>
-        </w:rPr>
+        <w:jc w:val="both"/>
+        <w:rPr/>
       </w:pPr>
       <w:r>
         <w:rPr>
@@ -1775,9 +1721,8 @@
           <w:numId w:val="2"/>
         </w:numPr>
         <w:bidi w:val="0"/>
-        <w:rPr>
-          <w:rFonts w:ascii="Times New Roman" w:hAnsi="Times New Roman" w:cs="Times New Roman"/>
-        </w:rPr>
+        <w:jc w:val="both"/>
+        <w:rPr/>
       </w:pPr>
       <w:r>
         <w:rPr>
@@ -1794,9 +1739,8 @@
           <w:numId w:val="2"/>
         </w:numPr>
         <w:bidi w:val="0"/>
-        <w:rPr>
-          <w:rFonts w:ascii="Times New Roman" w:hAnsi="Times New Roman" w:cs="Times New Roman"/>
-        </w:rPr>
+        <w:jc w:val="both"/>
+        <w:rPr/>
       </w:pPr>
       <w:r>
         <w:rPr>
@@ -1813,9 +1757,8 @@
           <w:numId w:val="2"/>
         </w:numPr>
         <w:bidi w:val="0"/>
-        <w:rPr>
-          <w:rFonts w:ascii="Times New Roman" w:hAnsi="Times New Roman" w:cs="Times New Roman"/>
-        </w:rPr>
+        <w:jc w:val="both"/>
+        <w:rPr/>
       </w:pPr>
       <w:r>
         <w:rPr>
@@ -1832,9 +1775,8 @@
           <w:numId w:val="2"/>
         </w:numPr>
         <w:bidi w:val="0"/>
-        <w:rPr>
-          <w:rFonts w:ascii="Times New Roman" w:hAnsi="Times New Roman" w:cs="Times New Roman"/>
-        </w:rPr>
+        <w:jc w:val="both"/>
+        <w:rPr/>
       </w:pPr>
       <w:r>
         <w:rPr>
@@ -1851,9 +1793,8 @@
           <w:numId w:val="2"/>
         </w:numPr>
         <w:bidi w:val="0"/>
-        <w:rPr>
-          <w:rFonts w:ascii="Times New Roman" w:hAnsi="Times New Roman" w:cs="Times New Roman"/>
-        </w:rPr>
+        <w:jc w:val="both"/>
+        <w:rPr/>
       </w:pPr>
       <w:r>
         <w:rPr>
@@ -1870,9 +1811,8 @@
           <w:numId w:val="2"/>
         </w:numPr>
         <w:bidi w:val="0"/>
-        <w:rPr>
-          <w:rFonts w:ascii="Times New Roman" w:hAnsi="Times New Roman" w:cs="Times New Roman"/>
-        </w:rPr>
+        <w:jc w:val="both"/>
+        <w:rPr/>
       </w:pPr>
       <w:r>
         <w:rPr>
@@ -1889,9 +1829,8 @@
           <w:numId w:val="2"/>
         </w:numPr>
         <w:bidi w:val="0"/>
-        <w:rPr>
-          <w:rFonts w:ascii="Times New Roman" w:hAnsi="Times New Roman" w:cs="Times New Roman"/>
-        </w:rPr>
+        <w:jc w:val="both"/>
+        <w:rPr/>
       </w:pPr>
       <w:r>
         <w:rPr>
@@ -1905,9 +1844,8 @@
         <w:pStyle w:val="Normal"/>
         <w:bidi w:val="0"/>
         <w:ind w:firstLine="850"/>
-        <w:rPr>
-          <w:rFonts w:ascii="Times New Roman" w:hAnsi="Times New Roman" w:cs="Times New Roman"/>
-        </w:rPr>
+        <w:jc w:val="both"/>
+        <w:rPr/>
       </w:pPr>
       <w:r>
         <w:rPr>
@@ -1920,7 +1858,7 @@
       <w:pPr>
         <w:pStyle w:val="Heading1"/>
         <w:ind w:hanging="0" w:left="0"/>
-        <w:jc w:val="left"/>
+        <w:jc w:val="both"/>
         <w:rPr/>
       </w:pPr>
       <w:bookmarkStart w:id="3" w:name="__RefHeading___Toc322_1067106403"/>
@@ -1947,9 +1885,8 @@
         <w:pStyle w:val="Normal"/>
         <w:bidi w:val="0"/>
         <w:ind w:firstLine="850"/>
-        <w:rPr>
-          <w:rFonts w:ascii="Times New Roman" w:hAnsi="Times New Roman" w:cs="Times New Roman"/>
-        </w:rPr>
+        <w:jc w:val="both"/>
+        <w:rPr/>
       </w:pPr>
       <w:r>
         <w:rPr>
@@ -1968,9 +1905,8 @@
         <w:pStyle w:val="Normal"/>
         <w:bidi w:val="0"/>
         <w:ind w:firstLine="850"/>
-        <w:rPr>
-          <w:rFonts w:ascii="Times New Roman" w:hAnsi="Times New Roman" w:cs="Times New Roman"/>
-        </w:rPr>
+        <w:jc w:val="both"/>
+        <w:rPr/>
       </w:pPr>
       <w:r>
         <w:rPr>
@@ -1989,9 +1925,8 @@
         <w:pStyle w:val="Normal"/>
         <w:bidi w:val="0"/>
         <w:ind w:firstLine="850"/>
-        <w:rPr>
-          <w:rFonts w:ascii="Times New Roman" w:hAnsi="Times New Roman" w:cs="Times New Roman"/>
-        </w:rPr>
+        <w:jc w:val="both"/>
+        <w:rPr/>
       </w:pPr>
       <w:r>
         <w:rPr>
@@ -2010,9 +1945,8 @@
         <w:pStyle w:val="Normal"/>
         <w:bidi w:val="0"/>
         <w:ind w:firstLine="850"/>
-        <w:rPr>
-          <w:rFonts w:ascii="Times New Roman" w:hAnsi="Times New Roman" w:cs="Times New Roman"/>
-        </w:rPr>
+        <w:jc w:val="both"/>
+        <w:rPr/>
       </w:pPr>
       <w:r>
         <w:rPr>
@@ -2031,9 +1965,8 @@
         <w:pStyle w:val="Normal"/>
         <w:bidi w:val="0"/>
         <w:ind w:firstLine="850"/>
-        <w:rPr>
-          <w:rFonts w:ascii="Times New Roman" w:hAnsi="Times New Roman" w:cs="Times New Roman"/>
-        </w:rPr>
+        <w:jc w:val="both"/>
+        <w:rPr/>
       </w:pPr>
       <w:r>
         <w:rPr>
@@ -2052,9 +1985,8 @@
         <w:pStyle w:val="Normal"/>
         <w:bidi w:val="0"/>
         <w:ind w:firstLine="850"/>
-        <w:rPr>
-          <w:rFonts w:ascii="Times New Roman" w:hAnsi="Times New Roman" w:cs="Times New Roman"/>
-        </w:rPr>
+        <w:jc w:val="both"/>
+        <w:rPr/>
       </w:pPr>
       <w:r>
         <w:rPr>
@@ -2073,9 +2005,8 @@
         <w:pStyle w:val="Normal"/>
         <w:bidi w:val="0"/>
         <w:ind w:firstLine="850"/>
-        <w:rPr>
-          <w:rFonts w:ascii="Times New Roman" w:hAnsi="Times New Roman" w:cs="Times New Roman"/>
-        </w:rPr>
+        <w:jc w:val="both"/>
+        <w:rPr/>
       </w:pPr>
       <w:r>
         <w:rPr>
@@ -2097,6 +2028,10 @@
           <w:numId w:val="3"/>
         </w:numPr>
         <w:bidi w:val="0"/>
+        <w:jc w:val="both"/>
+        <w:rPr/>
+      </w:pPr>
+      <w:r>
         <w:rPr>
           <w:rFonts w:cs="Times New Roman"/>
           <w:b w:val="false"/>
@@ -2105,6 +2040,19 @@
           <w:szCs w:val="24"/>
           <w:lang w:val="en-US"/>
         </w:rPr>
+        <w:t>store tasks persistently with their type, input data, priority, status, assigned executor, result, error, and timestamps;</w:t>
+      </w:r>
+    </w:p>
+    <w:p>
+      <w:pPr>
+        <w:pStyle w:val="Normal"/>
+        <w:numPr>
+          <w:ilvl w:val="0"/>
+          <w:numId w:val="3"/>
+        </w:numPr>
+        <w:bidi w:val="0"/>
+        <w:jc w:val="both"/>
+        <w:rPr/>
       </w:pPr>
       <w:r>
         <w:rPr>
@@ -2115,7 +2063,7 @@
           <w:szCs w:val="24"/>
           <w:lang w:val="en-US"/>
         </w:rPr>
-        <w:t>store tasks persistently with their type, input data, priority, status, assigned executor, result, error, and timestamps;</w:t>
+        <w:t>select pending tasks according to priority;</w:t>
       </w:r>
     </w:p>
     <w:p>
@@ -2126,6 +2074,10 @@
           <w:numId w:val="3"/>
         </w:numPr>
         <w:bidi w:val="0"/>
+        <w:jc w:val="both"/>
+        <w:rPr/>
+      </w:pPr>
+      <w:r>
         <w:rPr>
           <w:rFonts w:cs="Times New Roman"/>
           <w:b w:val="false"/>
@@ -2134,6 +2086,19 @@
           <w:szCs w:val="24"/>
           <w:lang w:val="en-US"/>
         </w:rPr>
+        <w:t>assign tasks to executor agents according to current executor load;</w:t>
+      </w:r>
+    </w:p>
+    <w:p>
+      <w:pPr>
+        <w:pStyle w:val="Normal"/>
+        <w:numPr>
+          <w:ilvl w:val="0"/>
+          <w:numId w:val="3"/>
+        </w:numPr>
+        <w:bidi w:val="0"/>
+        <w:jc w:val="both"/>
+        <w:rPr/>
       </w:pPr>
       <w:r>
         <w:rPr>
@@ -2144,7 +2109,7 @@
           <w:szCs w:val="24"/>
           <w:lang w:val="en-US"/>
         </w:rPr>
-        <w:t>select pending tasks according to priority;</w:t>
+        <w:t>send task assignments through JADE agent messages;</w:t>
       </w:r>
     </w:p>
     <w:p>
@@ -2155,6 +2120,10 @@
           <w:numId w:val="3"/>
         </w:numPr>
         <w:bidi w:val="0"/>
+        <w:jc w:val="both"/>
+        <w:rPr/>
+      </w:pPr>
+      <w:r>
         <w:rPr>
           <w:rFonts w:cs="Times New Roman"/>
           <w:b w:val="false"/>
@@ -2163,6 +2132,19 @@
           <w:szCs w:val="24"/>
           <w:lang w:val="en-US"/>
         </w:rPr>
+        <w:t>execute supported Java and Python task types;</w:t>
+      </w:r>
+    </w:p>
+    <w:p>
+      <w:pPr>
+        <w:pStyle w:val="Normal"/>
+        <w:numPr>
+          <w:ilvl w:val="0"/>
+          <w:numId w:val="3"/>
+        </w:numPr>
+        <w:bidi w:val="0"/>
+        <w:jc w:val="both"/>
+        <w:rPr/>
       </w:pPr>
       <w:r>
         <w:rPr>
@@ -2173,7 +2155,7 @@
           <w:szCs w:val="24"/>
           <w:lang w:val="en-US"/>
         </w:rPr>
-        <w:t>assign tasks to executor agents according to current executor load;</w:t>
+        <w:t>record successful completion and execution errors;</w:t>
       </w:r>
     </w:p>
     <w:p>
@@ -2184,6 +2166,10 @@
           <w:numId w:val="3"/>
         </w:numPr>
         <w:bidi w:val="0"/>
+        <w:jc w:val="both"/>
+        <w:rPr/>
+      </w:pPr>
+      <w:r>
         <w:rPr>
           <w:rFonts w:cs="Times New Roman"/>
           <w:b w:val="false"/>
@@ -2192,6 +2178,19 @@
           <w:szCs w:val="24"/>
           <w:lang w:val="en-US"/>
         </w:rPr>
+        <w:t>retry failed tasks only while attempt limits allow it;</w:t>
+      </w:r>
+    </w:p>
+    <w:p>
+      <w:pPr>
+        <w:pStyle w:val="Normal"/>
+        <w:numPr>
+          <w:ilvl w:val="0"/>
+          <w:numId w:val="3"/>
+        </w:numPr>
+        <w:bidi w:val="0"/>
+        <w:jc w:val="both"/>
+        <w:rPr/>
       </w:pPr>
       <w:r>
         <w:rPr>
@@ -2202,17 +2201,18 @@
           <w:szCs w:val="24"/>
           <w:lang w:val="en-US"/>
         </w:rPr>
-        <w:t>send task assignments through JADE agent messages;</w:t>
-      </w:r>
-    </w:p>
-    <w:p>
-      <w:pPr>
-        <w:pStyle w:val="Normal"/>
-        <w:numPr>
-          <w:ilvl w:val="0"/>
-          <w:numId w:val="3"/>
-        </w:numPr>
-        <w:bidi w:val="0"/>
+        <w:t>recover stale assigned or running tasks after interrupted execution.</w:t>
+      </w:r>
+    </w:p>
+    <w:p>
+      <w:pPr>
+        <w:pStyle w:val="Normal"/>
+        <w:bidi w:val="0"/>
+        <w:ind w:firstLine="850"/>
+        <w:jc w:val="both"/>
+        <w:rPr/>
+      </w:pPr>
+      <w:r>
         <w:rPr>
           <w:rFonts w:cs="Times New Roman"/>
           <w:b w:val="false"/>
@@ -2221,6 +2221,30 @@
           <w:szCs w:val="24"/>
           <w:lang w:val="en-US"/>
         </w:rPr>
+        <w:t>The scope of the thesis is limited to a local demonstration of a multi-agent scheduler. The system does not attempt to solve every form of distributed scheduling. It does not currently support task dependencies, deadlines, executor capability matching, distributed JADE containers on multiple physical machines, or dynamic executor discovery through the JADE Directory Facilitator. These features are left as possible future improvements. The goal of the project is to demonstrate a complete and understandable multi-agent scheduling system with persistent state, message-based coordination, and traceable task execution.</w:t>
+      </w:r>
+    </w:p>
+    <w:p>
+      <w:pPr>
+        <w:pStyle w:val="Heading1"/>
+        <w:ind w:hanging="0" w:left="0"/>
+        <w:jc w:val="both"/>
+        <w:rPr/>
+      </w:pPr>
+      <w:bookmarkStart w:id="6" w:name="__RefHeading___Toc1121_1138037686"/>
+      <w:bookmarkEnd w:id="6"/>
+      <w:r>
+        <w:rPr/>
+        <w:t>3. ANALYSIS OF EXISTING APPROACHES</w:t>
+      </w:r>
+    </w:p>
+    <w:p>
+      <w:pPr>
+        <w:pStyle w:val="Normal"/>
+        <w:bidi w:val="0"/>
+        <w:ind w:firstLine="850"/>
+        <w:jc w:val="both"/>
+        <w:rPr/>
       </w:pPr>
       <w:r>
         <w:rPr>
@@ -2231,17 +2255,32 @@
           <w:szCs w:val="24"/>
           <w:lang w:val="en-US"/>
         </w:rPr>
-        <w:t>execute supported Java and Python task types;</w:t>
-      </w:r>
-    </w:p>
-    <w:p>
-      <w:pPr>
-        <w:pStyle w:val="Normal"/>
-        <w:numPr>
-          <w:ilvl w:val="0"/>
-          <w:numId w:val="3"/>
-        </w:numPr>
-        <w:bidi w:val="0"/>
+        <w:t>This chapter compares several approaches that can be used to schedule and execute independent tasks. The comparison is used to justify the selected architecture of the implemented system.</w:t>
+      </w:r>
+    </w:p>
+    <w:p>
+      <w:pPr>
+        <w:pStyle w:val="Heading1"/>
+        <w:ind w:hanging="0" w:left="0"/>
+        <w:jc w:val="both"/>
+        <w:rPr/>
+      </w:pPr>
+      <w:bookmarkStart w:id="7" w:name="__RefHeading___Toc1138_1138037686"/>
+      <w:bookmarkEnd w:id="7"/>
+      <w:r>
+        <w:rPr/>
+        <w:t>3.1. Centralized Scheduling</w:t>
+      </w:r>
+    </w:p>
+    <w:p>
+      <w:pPr>
+        <w:pStyle w:val="Normal"/>
+        <w:bidi w:val="0"/>
+        <w:ind w:firstLine="850"/>
+        <w:jc w:val="both"/>
+        <w:rPr/>
+      </w:pPr>
+      <w:r>
         <w:rPr>
           <w:rFonts w:cs="Times New Roman"/>
           <w:b w:val="false"/>
@@ -2250,6 +2289,16 @@
           <w:szCs w:val="24"/>
           <w:lang w:val="en-US"/>
         </w:rPr>
+        <w:t>One possible approach to the task execution problem is centralized scheduling. In this model, a single scheduling component observes the available tasks, chooses the next task to execute, and assigns it to an execution resource. Casavant and Kuhl describe scheduling as part of the broader resource management problem in distributed computing systems [7]. This makes centralized scheduling a natural baseline because all decisions are made by one component with a clear view of the task queue and the available executors.</w:t>
+      </w:r>
+    </w:p>
+    <w:p>
+      <w:pPr>
+        <w:pStyle w:val="Normal"/>
+        <w:bidi w:val="0"/>
+        <w:ind w:firstLine="850"/>
+        <w:jc w:val="both"/>
+        <w:rPr/>
       </w:pPr>
       <w:r>
         <w:rPr>
@@ -2260,17 +2309,18 @@
           <w:szCs w:val="24"/>
           <w:lang w:val="en-US"/>
         </w:rPr>
-        <w:t>record successful completion and execution errors;</w:t>
-      </w:r>
-    </w:p>
-    <w:p>
-      <w:pPr>
-        <w:pStyle w:val="Normal"/>
-        <w:numPr>
-          <w:ilvl w:val="0"/>
-          <w:numId w:val="3"/>
-        </w:numPr>
-        <w:bidi w:val="0"/>
+        <w:t>Centralized scheduling is simple to understand and implement. The scheduler can apply one consistent policy, such as selecting the highest-priority pending task and assigning it to the least-loaded executor. This is also suitable for a local prototype, because it keeps the scheduling logic visible and easy to demonstrate. The system implemented in this thesis uses this idea through the coordinator agent.</w:t>
+      </w:r>
+    </w:p>
+    <w:p>
+      <w:pPr>
+        <w:pStyle w:val="Normal"/>
+        <w:bidi w:val="0"/>
+        <w:ind w:firstLine="850"/>
+        <w:jc w:val="both"/>
+        <w:rPr/>
+      </w:pPr>
+      <w:r>
         <w:rPr>
           <w:rFonts w:cs="Times New Roman"/>
           <w:b w:val="false"/>
@@ -2279,6 +2329,16 @@
           <w:szCs w:val="24"/>
           <w:lang w:val="en-US"/>
         </w:rPr>
+        <w:t>The limitation of this approach is that the scheduler becomes a central point of control. If the scheduler is stopped, pending tasks cannot be assigned until it is started again. Executors may still finish tasks that were already assigned, but new scheduling decisions depend on the coordinator. This limitation is acceptable in the current project because the goal is to demonstrate a clear multi-agent scheduling workflow rather than a fully fault-tolerant distributed scheduler.</w:t>
+      </w:r>
+    </w:p>
+    <w:p>
+      <w:pPr>
+        <w:pStyle w:val="Normal"/>
+        <w:bidi w:val="0"/>
+        <w:ind w:firstLine="850"/>
+        <w:jc w:val="both"/>
+        <w:rPr/>
       </w:pPr>
       <w:r>
         <w:rPr>
@@ -2289,20 +2349,30 @@
           <w:szCs w:val="24"/>
           <w:lang w:val="en-US"/>
         </w:rPr>
-        <w:t>retry failed tasks only while attempt limits allow it;</w:t>
-      </w:r>
-    </w:p>
-    <w:p>
-      <w:pPr>
-        <w:pStyle w:val="Normal"/>
-        <w:numPr>
-          <w:ilvl w:val="0"/>
-          <w:numId w:val="3"/>
-        </w:numPr>
-        <w:bidi w:val="0"/>
-        <w:rPr>
-          <w:rFonts w:ascii="Times New Roman" w:hAnsi="Times New Roman" w:cs="Times New Roman"/>
-        </w:rPr>
+        <w:t>The workload considered in this thesis consists of independent tasks. Beaumont et al. discuss bag-of-tasks applications, where tasks are independent and can be executed without dependencies between them [8]. This matches the implemented system because each task can be selected, assigned, executed, and completed without waiting for another task’s output. For this reason, a simple centralized scheduling strategy is appropriate for the scope of the project.</w:t>
+      </w:r>
+    </w:p>
+    <w:p>
+      <w:pPr>
+        <w:pStyle w:val="Heading1"/>
+        <w:ind w:hanging="0" w:left="0"/>
+        <w:jc w:val="both"/>
+        <w:rPr/>
+      </w:pPr>
+      <w:bookmarkStart w:id="8" w:name="__RefHeading___Toc1140_1138037686"/>
+      <w:bookmarkEnd w:id="8"/>
+      <w:r>
+        <w:rPr/>
+        <w:t>3.2. Broker-Based Task Queues</w:t>
+      </w:r>
+    </w:p>
+    <w:p>
+      <w:pPr>
+        <w:pStyle w:val="Normal"/>
+        <w:bidi w:val="0"/>
+        <w:ind w:firstLine="850"/>
+        <w:jc w:val="both"/>
+        <w:rPr/>
       </w:pPr>
       <w:r>
         <w:rPr>
@@ -2313,17 +2383,16 @@
           <w:szCs w:val="24"/>
           <w:lang w:val="en-US"/>
         </w:rPr>
-        <w:t>recover stale assigned or running tasks after interrupted execution.</w:t>
-      </w:r>
-    </w:p>
-    <w:p>
-      <w:pPr>
-        <w:pStyle w:val="Normal"/>
-        <w:bidi w:val="0"/>
-        <w:ind w:firstLine="850"/>
-        <w:rPr>
-          <w:rFonts w:ascii="Times New Roman" w:hAnsi="Times New Roman" w:cs="Times New Roman"/>
-        </w:rPr>
+        <w:t>Another common approach is to use a broker-based task queue. In this model, clients place tasks into a queue, and worker processes consume tasks from that queue. Celery describes task queues as a mechanism for distributing work across threads or machines, with workers monitoring queues for work and messages usually passing through a broker [15]. This model is widely used for asynchronous background processing.</w:t>
+      </w:r>
+    </w:p>
+    <w:p>
+      <w:pPr>
+        <w:pStyle w:val="Normal"/>
+        <w:bidi w:val="0"/>
+        <w:ind w:firstLine="850"/>
+        <w:jc w:val="both"/>
+        <w:rPr/>
       </w:pPr>
       <w:r>
         <w:rPr>
@@ -2334,31 +2403,16 @@
           <w:szCs w:val="24"/>
           <w:lang w:val="en-US"/>
         </w:rPr>
-        <w:t>The scope of the thesis is limited to a local demonstration of a multi-agent scheduler. The system does not attempt to solve every form of distributed scheduling. It does not currently support task dependencies, deadlines, executor capability matching, distributed JADE containers on multiple physical machines, or dynamic executor discovery through the JADE Directory Facilitator. These features are left as possible future improvements. The goal of the project is to demonstrate a complete and understandable multi-agent scheduling system with persistent state, message-based coordination, and traceable task execution.</w:t>
-      </w:r>
-    </w:p>
-    <w:p>
-      <w:pPr>
-        <w:pStyle w:val="Heading1"/>
-        <w:ind w:hanging="0" w:left="0"/>
-        <w:jc w:val="left"/>
-        <w:rPr/>
-      </w:pPr>
-      <w:bookmarkStart w:id="6" w:name="__RefHeading___Toc1121_1138037686"/>
-      <w:bookmarkEnd w:id="6"/>
-      <w:r>
-        <w:rPr/>
-        <w:t>3. ANALYSIS OF EXISTING APPROACHES</w:t>
-      </w:r>
-    </w:p>
-    <w:p>
-      <w:pPr>
-        <w:pStyle w:val="Normal"/>
-        <w:bidi w:val="0"/>
-        <w:ind w:firstLine="850"/>
-        <w:rPr>
-          <w:rFonts w:ascii="Times New Roman" w:hAnsi="Times New Roman" w:cs="Times New Roman"/>
-        </w:rPr>
+        <w:t>A broker-based queue has several advantages. It separates task submission from task execution, allows multiple workers to consume tasks, and often includes practical features such as retries, monitoring, scheduling, result storage, and worker management [15]. Frameworks such as Celery are mature and useful when the main goal is to execute background jobs reliably.</w:t>
+      </w:r>
+    </w:p>
+    <w:p>
+      <w:pPr>
+        <w:pStyle w:val="Normal"/>
+        <w:bidi w:val="0"/>
+        <w:ind w:firstLine="850"/>
+        <w:jc w:val="both"/>
+        <w:rPr/>
       </w:pPr>
       <w:r>
         <w:rPr>
@@ -2369,31 +2423,16 @@
           <w:szCs w:val="24"/>
           <w:lang w:val="en-US"/>
         </w:rPr>
-        <w:t>This chapter compares several approaches that can be used to schedule and execute independent tasks. The comparison is used to justify the selected architecture of the implemented system.</w:t>
-      </w:r>
-    </w:p>
-    <w:p>
-      <w:pPr>
-        <w:pStyle w:val="Heading1"/>
-        <w:ind w:hanging="0" w:left="0"/>
-        <w:jc w:val="left"/>
-        <w:rPr/>
-      </w:pPr>
-      <w:bookmarkStart w:id="7" w:name="__RefHeading___Toc1138_1138037686"/>
-      <w:bookmarkEnd w:id="7"/>
-      <w:r>
-        <w:rPr/>
-        <w:t>3.1. Centralized Scheduling</w:t>
-      </w:r>
-    </w:p>
-    <w:p>
-      <w:pPr>
-        <w:pStyle w:val="Normal"/>
-        <w:bidi w:val="0"/>
-        <w:ind w:firstLine="850"/>
-        <w:rPr>
-          <w:rFonts w:ascii="Times New Roman" w:hAnsi="Times New Roman" w:cs="Times New Roman"/>
-        </w:rPr>
+        <w:t>However, this thesis has a different focus. The goal is not only to process jobs, but to demonstrate a multi-agent system with explicit agent roles and message-based cooperation. If a ready-made task queue framework handled the assignment and delivery of tasks, much of the agent communication and scheduling logic would be hidden inside the framework. That would make the implementation less suitable for demonstrating how a coordinator agent and executor agents cooperate.</w:t>
+      </w:r>
+    </w:p>
+    <w:p>
+      <w:pPr>
+        <w:pStyle w:val="Normal"/>
+        <w:bidi w:val="0"/>
+        <w:ind w:firstLine="850"/>
+        <w:jc w:val="both"/>
+        <w:rPr/>
       </w:pPr>
       <w:r>
         <w:rPr>
@@ -2404,17 +2443,30 @@
           <w:szCs w:val="24"/>
           <w:lang w:val="en-US"/>
         </w:rPr>
-        <w:t>One possible approach to the task execution problem is centralized scheduling. In this model, a single scheduling component observes the available tasks, chooses the next task to execute, and assigns it to an execution resource. Casavant and Kuhl describe scheduling as part of the broader resource management problem in distributed computing systems [7]. This makes centralized scheduling a natural baseline because all decisions are made by one component with a clear view of the task queue and the available executors.</w:t>
-      </w:r>
-    </w:p>
-    <w:p>
-      <w:pPr>
-        <w:pStyle w:val="Normal"/>
-        <w:bidi w:val="0"/>
-        <w:ind w:firstLine="850"/>
-        <w:rPr>
-          <w:rFonts w:ascii="Times New Roman" w:hAnsi="Times New Roman" w:cs="Times New Roman"/>
-        </w:rPr>
+        <w:t>For this reason, a broker-based task queue is treated as an alternative approach rather than the selected architecture. It would be practical for a production background-job system, but it is less aligned with the educational and architectural goal of this thesis.</w:t>
+      </w:r>
+    </w:p>
+    <w:p>
+      <w:pPr>
+        <w:pStyle w:val="Heading1"/>
+        <w:ind w:hanging="0" w:left="0"/>
+        <w:jc w:val="both"/>
+        <w:rPr/>
+      </w:pPr>
+      <w:bookmarkStart w:id="9" w:name="__RefHeading___Toc1142_1138037686"/>
+      <w:bookmarkEnd w:id="9"/>
+      <w:r>
+        <w:rPr/>
+        <w:t>3.3. Database-Backed Task Queue</w:t>
+      </w:r>
+    </w:p>
+    <w:p>
+      <w:pPr>
+        <w:pStyle w:val="Normal"/>
+        <w:bidi w:val="0"/>
+        <w:ind w:firstLine="850"/>
+        <w:jc w:val="both"/>
+        <w:rPr/>
       </w:pPr>
       <w:r>
         <w:rPr>
@@ -2425,17 +2477,16 @@
           <w:szCs w:val="24"/>
           <w:lang w:val="en-US"/>
         </w:rPr>
-        <w:t>Centralized scheduling is simple to understand and implement. The scheduler can apply one consistent policy, such as selecting the highest-priority pending task and assigning it to the least-loaded executor. This is also suitable for a local prototype, because it keeps the scheduling logic visible and easy to demonstrate. The system implemented in this thesis uses this idea through the coordinator agent.</w:t>
-      </w:r>
-    </w:p>
-    <w:p>
-      <w:pPr>
-        <w:pStyle w:val="Normal"/>
-        <w:bidi w:val="0"/>
-        <w:ind w:firstLine="850"/>
-        <w:rPr>
-          <w:rFonts w:ascii="Times New Roman" w:hAnsi="Times New Roman" w:cs="Times New Roman"/>
-        </w:rPr>
+        <w:t>A third approach is to store tasks directly in a relational database and use task status fields to represent the execution lifecycle. In this model, tasks are represented as database rows. A scheduler or worker reads pending tasks, updates their status, assigns them to an executor, and later records completion or failure.</w:t>
+      </w:r>
+    </w:p>
+    <w:p>
+      <w:pPr>
+        <w:pStyle w:val="Normal"/>
+        <w:bidi w:val="0"/>
+        <w:ind w:firstLine="850"/>
+        <w:jc w:val="both"/>
+        <w:rPr/>
       </w:pPr>
       <w:r>
         <w:rPr>
@@ -2446,17 +2497,16 @@
           <w:szCs w:val="24"/>
           <w:lang w:val="en-US"/>
         </w:rPr>
-        <w:t>The limitation of this approach is that the scheduler becomes a central point of control. If the scheduler is stopped, pending tasks cannot be assigned until it is started again. Executors may still finish tasks that were already assigned, but new scheduling decisions depend on the coordinator. This limitation is acceptable in the current project because the goal is to demonstrate a clear multi-agent scheduling workflow rather than a fully fault-tolerant distributed scheduler.</w:t>
-      </w:r>
-    </w:p>
-    <w:p>
-      <w:pPr>
-        <w:pStyle w:val="Normal"/>
-        <w:bidi w:val="0"/>
-        <w:ind w:firstLine="850"/>
-        <w:rPr>
-          <w:rFonts w:ascii="Times New Roman" w:hAnsi="Times New Roman" w:cs="Times New Roman"/>
-        </w:rPr>
+        <w:t>This approach fits the implemented system because PostgreSQL can store the complete task lifecycle. The database contains task type, input data, priority, status, assigned executor, attempt counters, timestamps, result data, and error information. PostgreSQL transactions are useful because related changes can be applied as complete units [4]. This helps avoid incomplete state changes, such as a task being partially assigned or partially completed.</w:t>
+      </w:r>
+    </w:p>
+    <w:p>
+      <w:pPr>
+        <w:pStyle w:val="Normal"/>
+        <w:bidi w:val="0"/>
+        <w:ind w:firstLine="850"/>
+        <w:jc w:val="both"/>
+        <w:rPr/>
       </w:pPr>
       <w:r>
         <w:rPr>
@@ -2467,31 +2517,16 @@
           <w:szCs w:val="24"/>
           <w:lang w:val="en-US"/>
         </w:rPr>
-        <w:t>The workload considered in this thesis consists of independent tasks. Beaumont et al. discuss bag-of-tasks applications, where tasks are independent and can be executed without dependencies between them [8]. This matches the implemented system because each task can be selected, assigned, executed, and completed without waiting for another task’s output. For this reason, a simple centralized scheduling strategy is appropriate for the scope of the project.</w:t>
-      </w:r>
-    </w:p>
-    <w:p>
-      <w:pPr>
-        <w:pStyle w:val="Heading1"/>
-        <w:ind w:hanging="0" w:left="0"/>
-        <w:jc w:val="left"/>
-        <w:rPr/>
-      </w:pPr>
-      <w:bookmarkStart w:id="8" w:name="__RefHeading___Toc1140_1138037686"/>
-      <w:bookmarkEnd w:id="8"/>
-      <w:r>
-        <w:rPr/>
-        <w:t>3.2. Broker-Based Task Queues</w:t>
-      </w:r>
-    </w:p>
-    <w:p>
-      <w:pPr>
-        <w:pStyle w:val="Normal"/>
-        <w:bidi w:val="0"/>
-        <w:ind w:firstLine="850"/>
-        <w:rPr>
-          <w:rFonts w:ascii="Times New Roman" w:hAnsi="Times New Roman" w:cs="Times New Roman"/>
-        </w:rPr>
+        <w:t>Database-backed queues also make the system easier to inspect. A user can query the database or use the web dashboard to see which tasks are pending, assigned, running, completed, failed, or cancelled. The implemented system also records lifecycle events, which makes it possible to inspect not only the current task status, but also the sequence of status changes.</w:t>
+      </w:r>
+    </w:p>
+    <w:p>
+      <w:pPr>
+        <w:pStyle w:val="Normal"/>
+        <w:bidi w:val="0"/>
+        <w:ind w:firstLine="850"/>
+        <w:jc w:val="both"/>
+        <w:rPr/>
       </w:pPr>
       <w:r>
         <w:rPr>
@@ -2502,17 +2537,16 @@
           <w:szCs w:val="24"/>
           <w:lang w:val="en-US"/>
         </w:rPr>
-        <w:t>Another common approach is to use a broker-based task queue. In this model, clients place tasks into a queue, and worker processes consume tasks from that queue. Celery describes task queues as a mechanism for distributing work across threads or machines, with workers monitoring queues for work and messages usually passing through a broker [15]. This model is widely used for asynchronous background processing.</w:t>
-      </w:r>
-    </w:p>
-    <w:p>
-      <w:pPr>
-        <w:pStyle w:val="Normal"/>
-        <w:bidi w:val="0"/>
-        <w:ind w:firstLine="850"/>
-        <w:rPr>
-          <w:rFonts w:ascii="Times New Roman" w:hAnsi="Times New Roman" w:cs="Times New Roman"/>
-        </w:rPr>
+        <w:t>PostgreSQL also supports row-level locking. According to the PostgreSQL documentation, row-level locks block writers and lockers on the same row while still allowing normal data reading [16]. This is relevant for task queue designs because state transitions should protect individual task rows from conflicting updates. In the implemented system, conditional updates are used to ensure that a task changes state only when it is currently in the expected state.</w:t>
+      </w:r>
+    </w:p>
+    <w:p>
+      <w:pPr>
+        <w:pStyle w:val="Normal"/>
+        <w:bidi w:val="0"/>
+        <w:ind w:firstLine="850"/>
+        <w:jc w:val="both"/>
+        <w:rPr/>
       </w:pPr>
       <w:r>
         <w:rPr>
@@ -2523,17 +2557,30 @@
           <w:szCs w:val="24"/>
           <w:lang w:val="en-US"/>
         </w:rPr>
-        <w:t>A broker-based queue has several advantages. It separates task submission from task execution, allows multiple workers to consume tasks, and often includes practical features such as retries, monitoring, scheduling, result storage, and worker management [15]. Frameworks such as Celery are mature and useful when the main goal is to execute background jobs reliably.</w:t>
-      </w:r>
-    </w:p>
-    <w:p>
-      <w:pPr>
-        <w:pStyle w:val="Normal"/>
-        <w:bidi w:val="0"/>
-        <w:ind w:firstLine="850"/>
-        <w:rPr>
-          <w:rFonts w:ascii="Times New Roman" w:hAnsi="Times New Roman" w:cs="Times New Roman"/>
-        </w:rPr>
+        <w:t>The main limitation of a database-backed queue is that the database becomes a central shared dependency. For small and medium systems this is acceptable, especially when persistence and traceability are important. For very high-throughput distributed systems, a specialized broker may be more appropriate. In this thesis, the database-backed approach is appropriate because the project values persistent lifecycle state, simple inspection, and clear recovery behaviour.</w:t>
+      </w:r>
+    </w:p>
+    <w:p>
+      <w:pPr>
+        <w:pStyle w:val="Heading1"/>
+        <w:ind w:hanging="0" w:left="0"/>
+        <w:jc w:val="both"/>
+        <w:rPr/>
+      </w:pPr>
+      <w:bookmarkStart w:id="10" w:name="__RefHeading___Toc1144_1138037686"/>
+      <w:bookmarkEnd w:id="10"/>
+      <w:r>
+        <w:rPr/>
+        <w:t>3.4. Multi-Agent System Approach</w:t>
+      </w:r>
+    </w:p>
+    <w:p>
+      <w:pPr>
+        <w:pStyle w:val="Normal"/>
+        <w:bidi w:val="0"/>
+        <w:ind w:firstLine="850"/>
+        <w:jc w:val="both"/>
+        <w:rPr/>
       </w:pPr>
       <w:r>
         <w:rPr>
@@ -2544,17 +2591,16 @@
           <w:szCs w:val="24"/>
           <w:lang w:val="en-US"/>
         </w:rPr>
-        <w:t>However, this thesis has a different focus. The goal is not only to process jobs, but to demonstrate a multi-agent system with explicit agent roles and message-based cooperation. If a ready-made task queue framework handled the assignment and delivery of tasks, much of the agent communication and scheduling logic would be hidden inside the framework. That would make the implementation less suitable for demonstrating how a coordinator agent and executor agents cooperate.</w:t>
-      </w:r>
-    </w:p>
-    <w:p>
-      <w:pPr>
-        <w:pStyle w:val="Normal"/>
-        <w:bidi w:val="0"/>
-        <w:ind w:firstLine="850"/>
-        <w:rPr>
-          <w:rFonts w:ascii="Times New Roman" w:hAnsi="Times New Roman" w:cs="Times New Roman"/>
-        </w:rPr>
+        <w:t>The selected approach combines a database-backed task queue with a multi-agent architecture. Multi-agent systems organize software around interacting autonomous agents. Wooldridge and Jennings identify autonomy, social ability, reactivity, and proactiveness as important characteristics of agents [1]. Zambonelli, Jennings, and Wooldridge also describe agent-oriented design in terms of roles, responsibilities, interactions, and organizational structures [2].</w:t>
+      </w:r>
+    </w:p>
+    <w:p>
+      <w:pPr>
+        <w:pStyle w:val="Normal"/>
+        <w:bidi w:val="0"/>
+        <w:ind w:firstLine="850"/>
+        <w:jc w:val="both"/>
+        <w:rPr/>
       </w:pPr>
       <w:r>
         <w:rPr>
@@ -2565,31 +2611,16 @@
           <w:szCs w:val="24"/>
           <w:lang w:val="en-US"/>
         </w:rPr>
-        <w:t>For this reason, a broker-based task queue is treated as an alternative approach rather than the selected architecture. It would be practical for a production background-job system, but it is less aligned with the educational and architectural goal of this thesis.</w:t>
-      </w:r>
-    </w:p>
-    <w:p>
-      <w:pPr>
-        <w:pStyle w:val="Heading1"/>
-        <w:ind w:hanging="0" w:left="0"/>
-        <w:jc w:val="left"/>
-        <w:rPr/>
-      </w:pPr>
-      <w:bookmarkStart w:id="9" w:name="__RefHeading___Toc1142_1138037686"/>
-      <w:bookmarkEnd w:id="9"/>
-      <w:r>
-        <w:rPr/>
-        <w:t>3.3. Database-Backed Task Queue</w:t>
-      </w:r>
-    </w:p>
-    <w:p>
-      <w:pPr>
-        <w:pStyle w:val="Normal"/>
-        <w:bidi w:val="0"/>
-        <w:ind w:firstLine="850"/>
-        <w:rPr>
-          <w:rFonts w:ascii="Times New Roman" w:hAnsi="Times New Roman" w:cs="Times New Roman"/>
-        </w:rPr>
+        <w:t>In the implemented system, the coordinator and executor agents have separate responsibilities. The coordinator observes the task queue and assigns work. Executor agents receive assignments and perform the task execution. This separation makes the system more representative of a multi-agent design than a single monolithic scheduler-executor component.</w:t>
+      </w:r>
+    </w:p>
+    <w:p>
+      <w:pPr>
+        <w:pStyle w:val="Normal"/>
+        <w:bidi w:val="0"/>
+        <w:ind w:firstLine="850"/>
+        <w:jc w:val="both"/>
+        <w:rPr/>
       </w:pPr>
       <w:r>
         <w:rPr>
@@ -2600,17 +2631,16 @@
           <w:szCs w:val="24"/>
           <w:lang w:val="en-US"/>
         </w:rPr>
-        <w:t>A third approach is to store tasks directly in a relational database and use task status fields to represent the execution lifecycle. In this model, tasks are represented as database rows. A scheduler or worker reads pending tasks, updates their status, assigns them to an executor, and later records completion or failure.</w:t>
-      </w:r>
-    </w:p>
-    <w:p>
-      <w:pPr>
-        <w:pStyle w:val="Normal"/>
-        <w:bidi w:val="0"/>
-        <w:ind w:firstLine="850"/>
-        <w:rPr>
-          <w:rFonts w:ascii="Times New Roman" w:hAnsi="Times New Roman" w:cs="Times New Roman"/>
-        </w:rPr>
+        <w:t>JADE is used as the agent platform. Bellifemine et al. describe JADE as a framework for developing multi-agent applications and supporting agent communication according to FIPA specifications [5]. In this thesis, JADE provides the runtime environment for the coordinator and executor agents, while ACL messages are used to communicate task assignments.</w:t>
+      </w:r>
+    </w:p>
+    <w:p>
+      <w:pPr>
+        <w:pStyle w:val="Normal"/>
+        <w:bidi w:val="0"/>
+        <w:ind w:firstLine="850"/>
+        <w:jc w:val="both"/>
+        <w:rPr/>
       </w:pPr>
       <w:r>
         <w:rPr>
@@ -2621,17 +2651,16 @@
           <w:szCs w:val="24"/>
           <w:lang w:val="en-US"/>
         </w:rPr>
-        <w:t>This approach fits the implemented system because PostgreSQL can store the complete task lifecycle. The database contains task type, input data, priority, status, assigned executor, attempt counters, timestamps, result data, and error information. PostgreSQL transactions are useful because related changes can be applied as complete units [4]. This helps avoid incomplete state changes, such as a task being partially assigned or partially completed.</w:t>
-      </w:r>
-    </w:p>
-    <w:p>
-      <w:pPr>
-        <w:pStyle w:val="Normal"/>
-        <w:bidi w:val="0"/>
-        <w:ind w:firstLine="850"/>
-        <w:rPr>
-          <w:rFonts w:ascii="Times New Roman" w:hAnsi="Times New Roman" w:cs="Times New Roman"/>
-        </w:rPr>
+        <w:t>The multi-agent approach is useful because it makes cooperation explicit. The coordinator does not directly execute task logic. Instead, it sends an assignment message to an executor. The executor then verifies the assignment through the database, starts the task, executes the corresponding logic, and records the final result. This creates a clear division between scheduling, communication, execution, and persistence.</w:t>
+      </w:r>
+    </w:p>
+    <w:p>
+      <w:pPr>
+        <w:pStyle w:val="Normal"/>
+        <w:bidi w:val="0"/>
+        <w:ind w:firstLine="850"/>
+        <w:jc w:val="both"/>
+        <w:rPr/>
       </w:pPr>
       <w:r>
         <w:rPr>
@@ -2642,17 +2671,30 @@
           <w:szCs w:val="24"/>
           <w:lang w:val="en-US"/>
         </w:rPr>
-        <w:t>Database-backed queues also make the system easier to inspect. A user can query the database or use the web dashboard to see which tasks are pending, assigned, running, completed, failed, or cancelled. The implemented system also records lifecycle events, which makes it possible to inspect not only the current task status, but also the sequence of status changes.</w:t>
-      </w:r>
-    </w:p>
-    <w:p>
-      <w:pPr>
-        <w:pStyle w:val="Normal"/>
-        <w:bidi w:val="0"/>
-        <w:ind w:firstLine="850"/>
-        <w:rPr>
-          <w:rFonts w:ascii="Times New Roman" w:hAnsi="Times New Roman" w:cs="Times New Roman"/>
-        </w:rPr>
+        <w:t>The limitation of the current multi-agent implementation is that it remains intentionally small. Executor agents are configured manually, and dynamic discovery through the JADE Directory Facilitator is not implemented. The system also uses one coordinator, so scheduling is not distributed among multiple coordinator agents. These limitations keep the project understandable and demonstrable, while leaving space for future improvements.</w:t>
+      </w:r>
+    </w:p>
+    <w:p>
+      <w:pPr>
+        <w:pStyle w:val="Heading1"/>
+        <w:ind w:hanging="0" w:left="0"/>
+        <w:jc w:val="both"/>
+        <w:rPr/>
+      </w:pPr>
+      <w:bookmarkStart w:id="11" w:name="__RefHeading___Toc1146_1138037686"/>
+      <w:bookmarkEnd w:id="11"/>
+      <w:r>
+        <w:rPr/>
+        <w:t>3.5. Comparative Summary</w:t>
+      </w:r>
+    </w:p>
+    <w:p>
+      <w:pPr>
+        <w:pStyle w:val="Normal"/>
+        <w:bidi w:val="0"/>
+        <w:ind w:firstLine="850"/>
+        <w:jc w:val="both"/>
+        <w:rPr/>
       </w:pPr>
       <w:r>
         <w:rPr>
@@ -2663,181 +2705,6 @@
           <w:szCs w:val="24"/>
           <w:lang w:val="en-US"/>
         </w:rPr>
-        <w:t>PostgreSQL also supports row-level locking. According to the PostgreSQL documentation, row-level locks block writers and lockers on the same row while still allowing normal data reading [16]. This is relevant for task queue designs because state transitions should protect individual task rows from conflicting updates. In the implemented system, conditional updates are used to ensure that a task changes state only when it is currently in the expected state.</w:t>
-      </w:r>
-    </w:p>
-    <w:p>
-      <w:pPr>
-        <w:pStyle w:val="Normal"/>
-        <w:bidi w:val="0"/>
-        <w:ind w:firstLine="850"/>
-        <w:rPr>
-          <w:rFonts w:ascii="Times New Roman" w:hAnsi="Times New Roman" w:cs="Times New Roman"/>
-        </w:rPr>
-      </w:pPr>
-      <w:r>
-        <w:rPr>
-          <w:rFonts w:cs="Times New Roman"/>
-          <w:b w:val="false"/>
-          <w:bCs w:val="false"/>
-          <w:sz w:val="24"/>
-          <w:szCs w:val="24"/>
-          <w:lang w:val="en-US"/>
-        </w:rPr>
-        <w:t>The main limitation of a database-backed queue is that the database becomes a central shared dependency. For small and medium systems this is acceptable, especially when persistence and traceability are important. For very high-throughput distributed systems, a specialized broker may be more appropriate. In this thesis, the database-backed approach is appropriate because the project values persistent lifecycle state, simple inspection, and clear recovery behaviour.</w:t>
-      </w:r>
-    </w:p>
-    <w:p>
-      <w:pPr>
-        <w:pStyle w:val="Heading1"/>
-        <w:ind w:hanging="0" w:left="0"/>
-        <w:jc w:val="left"/>
-        <w:rPr/>
-      </w:pPr>
-      <w:bookmarkStart w:id="10" w:name="__RefHeading___Toc1144_1138037686"/>
-      <w:bookmarkEnd w:id="10"/>
-      <w:r>
-        <w:rPr/>
-        <w:t>3.4. Multi-Agent System Approach</w:t>
-      </w:r>
-    </w:p>
-    <w:p>
-      <w:pPr>
-        <w:pStyle w:val="Normal"/>
-        <w:bidi w:val="0"/>
-        <w:ind w:firstLine="850"/>
-        <w:rPr>
-          <w:rFonts w:ascii="Times New Roman" w:hAnsi="Times New Roman" w:cs="Times New Roman"/>
-        </w:rPr>
-      </w:pPr>
-      <w:r>
-        <w:rPr>
-          <w:rFonts w:cs="Times New Roman"/>
-          <w:b w:val="false"/>
-          <w:bCs w:val="false"/>
-          <w:sz w:val="24"/>
-          <w:szCs w:val="24"/>
-          <w:lang w:val="en-US"/>
-        </w:rPr>
-        <w:t>The selected approach combines a database-backed task queue with a multi-agent architecture. Multi-agent systems organize software around interacting autonomous agents. Wooldridge and Jennings identify autonomy, social ability, reactivity, and proactiveness as important characteristics of agents [1]. Zambonelli, Jennings, and Wooldridge also describe agent-oriented design in terms of roles, responsibilities, interactions, and organizational structures [2].</w:t>
-      </w:r>
-    </w:p>
-    <w:p>
-      <w:pPr>
-        <w:pStyle w:val="Normal"/>
-        <w:bidi w:val="0"/>
-        <w:ind w:firstLine="850"/>
-        <w:rPr>
-          <w:rFonts w:ascii="Times New Roman" w:hAnsi="Times New Roman" w:cs="Times New Roman"/>
-        </w:rPr>
-      </w:pPr>
-      <w:r>
-        <w:rPr>
-          <w:rFonts w:cs="Times New Roman"/>
-          <w:b w:val="false"/>
-          <w:bCs w:val="false"/>
-          <w:sz w:val="24"/>
-          <w:szCs w:val="24"/>
-          <w:lang w:val="en-US"/>
-        </w:rPr>
-        <w:t>In the implemented system, the coordinator and executor agents have separate responsibilities. The coordinator observes the task queue and assigns work. Executor agents receive assignments and perform the task execution. This separation makes the system more representative of a multi-agent design than a single monolithic scheduler-executor component.</w:t>
-      </w:r>
-    </w:p>
-    <w:p>
-      <w:pPr>
-        <w:pStyle w:val="Normal"/>
-        <w:bidi w:val="0"/>
-        <w:ind w:firstLine="850"/>
-        <w:rPr>
-          <w:rFonts w:ascii="Times New Roman" w:hAnsi="Times New Roman" w:cs="Times New Roman"/>
-        </w:rPr>
-      </w:pPr>
-      <w:r>
-        <w:rPr>
-          <w:rFonts w:cs="Times New Roman"/>
-          <w:b w:val="false"/>
-          <w:bCs w:val="false"/>
-          <w:sz w:val="24"/>
-          <w:szCs w:val="24"/>
-          <w:lang w:val="en-US"/>
-        </w:rPr>
-        <w:t>JADE is used as the agent platform. Bellifemine et al. describe JADE as a framework for developing multi-agent applications and supporting agent communication according to FIPA specifications [5]. In this thesis, JADE provides the runtime environment for the coordinator and executor agents, while ACL messages are used to communicate task assignments.</w:t>
-      </w:r>
-    </w:p>
-    <w:p>
-      <w:pPr>
-        <w:pStyle w:val="Normal"/>
-        <w:bidi w:val="0"/>
-        <w:ind w:firstLine="850"/>
-        <w:rPr>
-          <w:rFonts w:ascii="Times New Roman" w:hAnsi="Times New Roman" w:cs="Times New Roman"/>
-        </w:rPr>
-      </w:pPr>
-      <w:r>
-        <w:rPr>
-          <w:rFonts w:cs="Times New Roman"/>
-          <w:b w:val="false"/>
-          <w:bCs w:val="false"/>
-          <w:sz w:val="24"/>
-          <w:szCs w:val="24"/>
-          <w:lang w:val="en-US"/>
-        </w:rPr>
-        <w:t>The multi-agent approach is useful because it makes cooperation explicit. The coordinator does not directly execute task logic. Instead, it sends an assignment message to an executor. The executor then verifies the assignment through the database, starts the task, executes the corresponding logic, and records the final result. This creates a clear division between scheduling, communication, execution, and persistence.</w:t>
-      </w:r>
-    </w:p>
-    <w:p>
-      <w:pPr>
-        <w:pStyle w:val="Normal"/>
-        <w:bidi w:val="0"/>
-        <w:ind w:firstLine="850"/>
-        <w:rPr>
-          <w:rFonts w:ascii="Times New Roman" w:hAnsi="Times New Roman" w:cs="Times New Roman"/>
-        </w:rPr>
-      </w:pPr>
-      <w:r>
-        <w:rPr>
-          <w:rFonts w:cs="Times New Roman"/>
-          <w:b w:val="false"/>
-          <w:bCs w:val="false"/>
-          <w:sz w:val="24"/>
-          <w:szCs w:val="24"/>
-          <w:lang w:val="en-US"/>
-        </w:rPr>
-        <w:t>The limitation of the current multi-agent implementation is that it remains intentionally small. Executor agents are configured manually, and dynamic discovery through the JADE Directory Facilitator is not implemented. The system also uses one coordinator, so scheduling is not distributed among multiple coordinator agents. These limitations keep the project understandable and demonstrable, while leaving space for future improvements.</w:t>
-      </w:r>
-    </w:p>
-    <w:p>
-      <w:pPr>
-        <w:pStyle w:val="Heading1"/>
-        <w:ind w:hanging="0" w:left="0"/>
-        <w:jc w:val="left"/>
-        <w:rPr/>
-      </w:pPr>
-      <w:bookmarkStart w:id="11" w:name="__RefHeading___Toc1146_1138037686"/>
-      <w:bookmarkEnd w:id="11"/>
-      <w:r>
-        <w:rPr/>
-        <w:t>3.5. Comparative Summary</w:t>
-      </w:r>
-    </w:p>
-    <w:p>
-      <w:pPr>
-        <w:pStyle w:val="Normal"/>
-        <w:bidi w:val="0"/>
-        <w:ind w:firstLine="850"/>
-        <w:rPr>
-          <w:rFonts w:ascii="Times New Roman" w:hAnsi="Times New Roman" w:cs="Times New Roman"/>
-        </w:rPr>
-      </w:pPr>
-      <w:r>
-        <w:rPr>
-          <w:rFonts w:cs="Times New Roman"/>
-          <w:b w:val="false"/>
-          <w:bCs w:val="false"/>
-          <w:sz w:val="24"/>
-          <w:szCs w:val="24"/>
-          <w:lang w:val="en-US"/>
-        </w:rPr>
         <w:t>The comparison shows that each approach has a different role. A centralized scheduler is simple and suitable for clear decision-making. A broker-based task queue is practical for production background processing, but it hides much of the scheduling and communication logic. A database-backed queue provides persistence and traceability. A multi-agent system makes the cooperation between software entities explicit.</w:t>
       </w:r>
     </w:p>
@@ -2846,9 +2713,8 @@
         <w:pStyle w:val="Normal"/>
         <w:bidi w:val="0"/>
         <w:ind w:firstLine="850"/>
-        <w:rPr>
-          <w:rFonts w:ascii="Times New Roman" w:hAnsi="Times New Roman" w:cs="Times New Roman"/>
-        </w:rPr>
+        <w:jc w:val="both"/>
+        <w:rPr/>
       </w:pPr>
       <w:r>
         <w:rPr>
@@ -2900,22 +2766,7 @@
               <w:keepNext w:val="true"/>
               <w:spacing w:before="120" w:after="120"/>
               <w:jc w:val="center"/>
-              <w:rPr>
-                <w:rFonts w:ascii="Times New Roman" w:hAnsi="Times New Roman"/>
-                <w:b w:val="false"/>
-                <w:bCs w:val="false"/>
-                <w:i w:val="false"/>
-                <w:i w:val="false"/>
-                <w:iCs w:val="false"/>
-                <w:strike w:val="false"/>
-                <w:dstrike w:val="false"/>
-                <w:outline w:val="false"/>
-                <w:shadow w:val="false"/>
-                <w:color w:val="000000"/>
-                <w:sz w:val="24"/>
-                <w:szCs w:val="24"/>
-                <w:u w:val="none"/>
-              </w:rPr>
+              <w:rPr/>
             </w:pPr>
             <w:r>
               <w:rPr>
@@ -2952,9 +2803,7 @@
               <w:pStyle w:val="TableContents"/>
               <w:spacing w:before="120" w:after="120"/>
               <w:jc w:val="center"/>
-              <w:rPr>
-                <w:rFonts w:ascii="Times New Roman" w:hAnsi="Times New Roman"/>
-              </w:rPr>
+              <w:rPr/>
             </w:pPr>
             <w:r>
               <w:rPr/>
@@ -2977,22 +2826,7 @@
               <w:pStyle w:val="TableContents"/>
               <w:spacing w:before="120" w:after="120"/>
               <w:jc w:val="center"/>
-              <w:rPr>
-                <w:rFonts w:ascii="Times New Roman" w:hAnsi="Times New Roman"/>
-                <w:b w:val="false"/>
-                <w:bCs w:val="false"/>
-                <w:i w:val="false"/>
-                <w:i w:val="false"/>
-                <w:iCs w:val="false"/>
-                <w:strike w:val="false"/>
-                <w:dstrike w:val="false"/>
-                <w:outline w:val="false"/>
-                <w:shadow w:val="false"/>
-                <w:color w:val="000000"/>
-                <w:sz w:val="24"/>
-                <w:szCs w:val="24"/>
-                <w:u w:val="none"/>
-              </w:rPr>
+              <w:rPr/>
             </w:pPr>
             <w:r>
               <w:rPr>
@@ -3029,22 +2863,7 @@
               <w:pStyle w:val="TableContents"/>
               <w:spacing w:before="120" w:after="120"/>
               <w:jc w:val="center"/>
-              <w:rPr>
-                <w:rFonts w:ascii="Times New Roman" w:hAnsi="Times New Roman"/>
-                <w:b w:val="false"/>
-                <w:bCs w:val="false"/>
-                <w:i w:val="false"/>
-                <w:i w:val="false"/>
-                <w:iCs w:val="false"/>
-                <w:strike w:val="false"/>
-                <w:dstrike w:val="false"/>
-                <w:outline w:val="false"/>
-                <w:shadow w:val="false"/>
-                <w:color w:val="000000"/>
-                <w:sz w:val="24"/>
-                <w:szCs w:val="24"/>
-                <w:u w:val="none"/>
-              </w:rPr>
+              <w:rPr/>
             </w:pPr>
             <w:r>
               <w:rPr>
@@ -3083,22 +2902,7 @@
               <w:keepNext w:val="true"/>
               <w:spacing w:before="120" w:after="120"/>
               <w:jc w:val="center"/>
-              <w:rPr>
-                <w:rFonts w:ascii="Times New Roman" w:hAnsi="Times New Roman"/>
-                <w:b w:val="false"/>
-                <w:bCs w:val="false"/>
-                <w:i w:val="false"/>
-                <w:i w:val="false"/>
-                <w:iCs w:val="false"/>
-                <w:strike w:val="false"/>
-                <w:dstrike w:val="false"/>
-                <w:outline w:val="false"/>
-                <w:shadow w:val="false"/>
-                <w:color w:val="000000"/>
-                <w:sz w:val="24"/>
-                <w:szCs w:val="24"/>
-                <w:u w:val="none"/>
-              </w:rPr>
+              <w:rPr/>
             </w:pPr>
             <w:r>
               <w:rPr>
@@ -3133,9 +2937,7 @@
               <w:pStyle w:val="TableContents"/>
               <w:spacing w:before="120" w:after="120"/>
               <w:jc w:val="center"/>
-              <w:rPr>
-                <w:rFonts w:ascii="Times New Roman" w:hAnsi="Times New Roman"/>
-              </w:rPr>
+              <w:rPr/>
             </w:pPr>
             <w:r>
               <w:rPr/>
@@ -3156,22 +2958,7 @@
               <w:pStyle w:val="TableContents"/>
               <w:spacing w:before="120" w:after="120"/>
               <w:jc w:val="center"/>
-              <w:rPr>
-                <w:rFonts w:ascii="Times New Roman" w:hAnsi="Times New Roman"/>
-                <w:b w:val="false"/>
-                <w:bCs w:val="false"/>
-                <w:i w:val="false"/>
-                <w:i w:val="false"/>
-                <w:iCs w:val="false"/>
-                <w:strike w:val="false"/>
-                <w:dstrike w:val="false"/>
-                <w:outline w:val="false"/>
-                <w:shadow w:val="false"/>
-                <w:color w:val="000000"/>
-                <w:sz w:val="24"/>
-                <w:szCs w:val="24"/>
-                <w:u w:val="none"/>
-              </w:rPr>
+              <w:rPr/>
             </w:pPr>
             <w:r>
               <w:rPr>
@@ -3206,22 +2993,7 @@
               <w:pStyle w:val="TableContents"/>
               <w:spacing w:before="120" w:after="120"/>
               <w:jc w:val="center"/>
-              <w:rPr>
-                <w:rFonts w:ascii="Times New Roman" w:hAnsi="Times New Roman"/>
-                <w:b w:val="false"/>
-                <w:bCs w:val="false"/>
-                <w:i w:val="false"/>
-                <w:i w:val="false"/>
-                <w:iCs w:val="false"/>
-                <w:strike w:val="false"/>
-                <w:dstrike w:val="false"/>
-                <w:outline w:val="false"/>
-                <w:shadow w:val="false"/>
-                <w:color w:val="000000"/>
-                <w:sz w:val="24"/>
-                <w:szCs w:val="24"/>
-                <w:u w:val="none"/>
-              </w:rPr>
+              <w:rPr/>
             </w:pPr>
             <w:r>
               <w:rPr>
@@ -3260,22 +3032,7 @@
               <w:keepNext w:val="true"/>
               <w:spacing w:before="120" w:after="120"/>
               <w:jc w:val="center"/>
-              <w:rPr>
-                <w:rFonts w:ascii="Times New Roman" w:hAnsi="Times New Roman"/>
-                <w:b w:val="false"/>
-                <w:bCs w:val="false"/>
-                <w:i w:val="false"/>
-                <w:i w:val="false"/>
-                <w:iCs w:val="false"/>
-                <w:strike w:val="false"/>
-                <w:dstrike w:val="false"/>
-                <w:outline w:val="false"/>
-                <w:shadow w:val="false"/>
-                <w:color w:val="000000"/>
-                <w:sz w:val="24"/>
-                <w:szCs w:val="24"/>
-                <w:u w:val="none"/>
-              </w:rPr>
+              <w:rPr/>
             </w:pPr>
             <w:r>
               <w:rPr>
@@ -3310,9 +3067,7 @@
               <w:pStyle w:val="TableContents"/>
               <w:spacing w:before="120" w:after="120"/>
               <w:jc w:val="center"/>
-              <w:rPr>
-                <w:rFonts w:ascii="Times New Roman" w:hAnsi="Times New Roman"/>
-              </w:rPr>
+              <w:rPr/>
             </w:pPr>
             <w:r>
               <w:rPr/>
@@ -3333,22 +3088,7 @@
               <w:pStyle w:val="TableContents"/>
               <w:spacing w:before="120" w:after="120"/>
               <w:jc w:val="center"/>
-              <w:rPr>
-                <w:rFonts w:ascii="Times New Roman" w:hAnsi="Times New Roman"/>
-                <w:b w:val="false"/>
-                <w:bCs w:val="false"/>
-                <w:i w:val="false"/>
-                <w:i w:val="false"/>
-                <w:iCs w:val="false"/>
-                <w:strike w:val="false"/>
-                <w:dstrike w:val="false"/>
-                <w:outline w:val="false"/>
-                <w:shadow w:val="false"/>
-                <w:color w:val="000000"/>
-                <w:sz w:val="24"/>
-                <w:szCs w:val="24"/>
-                <w:u w:val="none"/>
-              </w:rPr>
+              <w:rPr/>
             </w:pPr>
             <w:r>
               <w:rPr>
@@ -3383,22 +3123,7 @@
               <w:pStyle w:val="TableContents"/>
               <w:spacing w:before="120" w:after="120"/>
               <w:jc w:val="center"/>
-              <w:rPr>
-                <w:rFonts w:ascii="Times New Roman" w:hAnsi="Times New Roman"/>
-                <w:b w:val="false"/>
-                <w:bCs w:val="false"/>
-                <w:i w:val="false"/>
-                <w:i w:val="false"/>
-                <w:iCs w:val="false"/>
-                <w:strike w:val="false"/>
-                <w:dstrike w:val="false"/>
-                <w:outline w:val="false"/>
-                <w:shadow w:val="false"/>
-                <w:color w:val="000000"/>
-                <w:sz w:val="24"/>
-                <w:szCs w:val="24"/>
-                <w:u w:val="none"/>
-              </w:rPr>
+              <w:rPr/>
             </w:pPr>
             <w:r>
               <w:rPr>
@@ -3437,22 +3162,7 @@
               <w:keepNext w:val="true"/>
               <w:spacing w:before="120" w:after="120"/>
               <w:jc w:val="center"/>
-              <w:rPr>
-                <w:rFonts w:ascii="Times New Roman" w:hAnsi="Times New Roman"/>
-                <w:b w:val="false"/>
-                <w:bCs w:val="false"/>
-                <w:i w:val="false"/>
-                <w:i w:val="false"/>
-                <w:iCs w:val="false"/>
-                <w:strike w:val="false"/>
-                <w:dstrike w:val="false"/>
-                <w:outline w:val="false"/>
-                <w:shadow w:val="false"/>
-                <w:color w:val="000000"/>
-                <w:sz w:val="24"/>
-                <w:szCs w:val="24"/>
-                <w:u w:val="none"/>
-              </w:rPr>
+              <w:rPr/>
             </w:pPr>
             <w:r>
               <w:rPr>
@@ -3487,9 +3197,7 @@
               <w:pStyle w:val="TableContents"/>
               <w:spacing w:before="120" w:after="120"/>
               <w:jc w:val="center"/>
-              <w:rPr>
-                <w:rFonts w:ascii="Times New Roman" w:hAnsi="Times New Roman"/>
-              </w:rPr>
+              <w:rPr/>
             </w:pPr>
             <w:r>
               <w:rPr/>
@@ -3510,22 +3218,7 @@
               <w:pStyle w:val="TableContents"/>
               <w:spacing w:before="120" w:after="120"/>
               <w:jc w:val="center"/>
-              <w:rPr>
-                <w:rFonts w:ascii="Times New Roman" w:hAnsi="Times New Roman"/>
-                <w:b w:val="false"/>
-                <w:bCs w:val="false"/>
-                <w:i w:val="false"/>
-                <w:i w:val="false"/>
-                <w:iCs w:val="false"/>
-                <w:strike w:val="false"/>
-                <w:dstrike w:val="false"/>
-                <w:outline w:val="false"/>
-                <w:shadow w:val="false"/>
-                <w:color w:val="000000"/>
-                <w:sz w:val="24"/>
-                <w:szCs w:val="24"/>
-                <w:u w:val="none"/>
-              </w:rPr>
+              <w:rPr/>
             </w:pPr>
             <w:r>
               <w:rPr>
@@ -3560,22 +3253,7 @@
               <w:pStyle w:val="TableContents"/>
               <w:spacing w:before="120" w:after="120"/>
               <w:jc w:val="center"/>
-              <w:rPr>
-                <w:rFonts w:ascii="Times New Roman" w:hAnsi="Times New Roman"/>
-                <w:b w:val="false"/>
-                <w:bCs w:val="false"/>
-                <w:i w:val="false"/>
-                <w:i w:val="false"/>
-                <w:iCs w:val="false"/>
-                <w:strike w:val="false"/>
-                <w:dstrike w:val="false"/>
-                <w:outline w:val="false"/>
-                <w:shadow w:val="false"/>
-                <w:color w:val="000000"/>
-                <w:sz w:val="24"/>
-                <w:szCs w:val="24"/>
-                <w:u w:val="none"/>
-              </w:rPr>
+              <w:rPr/>
             </w:pPr>
             <w:r>
               <w:rPr>
@@ -3615,22 +3293,7 @@
               <w:keepNext w:val="true"/>
               <w:spacing w:before="120" w:after="120"/>
               <w:jc w:val="center"/>
-              <w:rPr>
-                <w:rFonts w:ascii="Times New Roman" w:hAnsi="Times New Roman"/>
-                <w:b w:val="false"/>
-                <w:bCs w:val="false"/>
-                <w:i w:val="false"/>
-                <w:i w:val="false"/>
-                <w:iCs w:val="false"/>
-                <w:strike w:val="false"/>
-                <w:dstrike w:val="false"/>
-                <w:outline w:val="false"/>
-                <w:shadow w:val="false"/>
-                <w:color w:val="000000"/>
-                <w:sz w:val="24"/>
-                <w:szCs w:val="24"/>
-                <w:u w:val="none"/>
-              </w:rPr>
+              <w:rPr/>
             </w:pPr>
             <w:r>
               <w:rPr>
@@ -3666,9 +3329,7 @@
               <w:pStyle w:val="TableContents"/>
               <w:spacing w:before="120" w:after="120"/>
               <w:jc w:val="center"/>
-              <w:rPr>
-                <w:rFonts w:ascii="Times New Roman" w:hAnsi="Times New Roman"/>
-              </w:rPr>
+              <w:rPr/>
             </w:pPr>
             <w:r>
               <w:rPr/>
@@ -3690,22 +3351,7 @@
               <w:pStyle w:val="TableContents"/>
               <w:spacing w:before="120" w:after="120"/>
               <w:jc w:val="center"/>
-              <w:rPr>
-                <w:rFonts w:ascii="Times New Roman" w:hAnsi="Times New Roman"/>
-                <w:b w:val="false"/>
-                <w:bCs w:val="false"/>
-                <w:i w:val="false"/>
-                <w:i w:val="false"/>
-                <w:iCs w:val="false"/>
-                <w:strike w:val="false"/>
-                <w:dstrike w:val="false"/>
-                <w:outline w:val="false"/>
-                <w:shadow w:val="false"/>
-                <w:color w:val="000000"/>
-                <w:sz w:val="24"/>
-                <w:szCs w:val="24"/>
-                <w:u w:val="none"/>
-              </w:rPr>
+              <w:rPr/>
             </w:pPr>
             <w:r>
               <w:rPr>
@@ -3741,22 +3387,7 @@
               <w:pStyle w:val="TableContents"/>
               <w:spacing w:before="120" w:after="120"/>
               <w:jc w:val="center"/>
-              <w:rPr>
-                <w:rFonts w:ascii="Times New Roman" w:hAnsi="Times New Roman"/>
-                <w:b w:val="false"/>
-                <w:bCs w:val="false"/>
-                <w:i w:val="false"/>
-                <w:i w:val="false"/>
-                <w:iCs w:val="false"/>
-                <w:strike w:val="false"/>
-                <w:dstrike w:val="false"/>
-                <w:outline w:val="false"/>
-                <w:shadow w:val="false"/>
-                <w:color w:val="000000"/>
-                <w:sz w:val="24"/>
-                <w:szCs w:val="24"/>
-                <w:u w:val="none"/>
-              </w:rPr>
+              <w:rPr/>
             </w:pPr>
             <w:r>
               <w:rPr>
@@ -3782,6 +3413,7 @@
     <w:p>
       <w:pPr>
         <w:pStyle w:val="Table"/>
+        <w:jc w:val="both"/>
         <w:rPr/>
       </w:pPr>
       <w:r>
@@ -3817,7 +3449,7 @@
       <w:pPr>
         <w:pStyle w:val="Heading1"/>
         <w:ind w:hanging="0" w:left="0"/>
-        <w:jc w:val="left"/>
+        <w:jc w:val="both"/>
         <w:rPr/>
       </w:pPr>
       <w:bookmarkStart w:id="12" w:name="__RefHeading___Toc1123_1138037686"/>
@@ -3830,7 +3462,7 @@
     <w:p>
       <w:pPr>
         <w:pStyle w:val="Heading1"/>
-        <w:jc w:val="left"/>
+        <w:jc w:val="both"/>
         <w:rPr/>
       </w:pPr>
       <w:bookmarkStart w:id="13" w:name="__RefHeading___Toc944_3284332197"/>
@@ -3845,9 +3477,8 @@
         <w:pStyle w:val="Normal"/>
         <w:bidi w:val="0"/>
         <w:ind w:firstLine="850"/>
-        <w:rPr>
-          <w:rFonts w:ascii="Times New Roman" w:hAnsi="Times New Roman" w:cs="Times New Roman"/>
-        </w:rPr>
+        <w:jc w:val="both"/>
+        <w:rPr/>
       </w:pPr>
       <w:r>
         <w:rPr>
@@ -3866,9 +3497,8 @@
         <w:pStyle w:val="Normal"/>
         <w:bidi w:val="0"/>
         <w:ind w:firstLine="850"/>
-        <w:rPr>
-          <w:rFonts w:ascii="Times New Roman" w:hAnsi="Times New Roman" w:cs="Times New Roman"/>
-        </w:rPr>
+        <w:jc w:val="both"/>
+        <w:rPr/>
       </w:pPr>
       <w:r>
         <w:rPr>
@@ -3887,9 +3517,8 @@
         <w:pStyle w:val="Normal"/>
         <w:bidi w:val="0"/>
         <w:ind w:firstLine="850"/>
-        <w:rPr>
-          <w:rFonts w:ascii="Times New Roman" w:hAnsi="Times New Roman" w:cs="Times New Roman"/>
-        </w:rPr>
+        <w:jc w:val="both"/>
+        <w:rPr/>
       </w:pPr>
       <w:r>
         <w:rPr>
@@ -3906,7 +3535,7 @@
     <w:p>
       <w:pPr>
         <w:pStyle w:val="Heading1"/>
-        <w:jc w:val="left"/>
+        <w:jc w:val="both"/>
         <w:rPr/>
       </w:pPr>
       <w:bookmarkStart w:id="14" w:name="__RefHeading___Toc946_3284332197"/>
@@ -3921,9 +3550,8 @@
         <w:pStyle w:val="Normal"/>
         <w:bidi w:val="0"/>
         <w:ind w:firstLine="850"/>
-        <w:rPr>
-          <w:rFonts w:ascii="Times New Roman" w:hAnsi="Times New Roman" w:cs="Times New Roman"/>
-        </w:rPr>
+        <w:jc w:val="both"/>
+        <w:rPr/>
       </w:pPr>
       <w:r>
         <w:rPr>
@@ -3942,9 +3570,8 @@
         <w:pStyle w:val="Normal"/>
         <w:bidi w:val="0"/>
         <w:ind w:firstLine="850"/>
-        <w:rPr>
-          <w:rFonts w:ascii="Times New Roman" w:hAnsi="Times New Roman" w:cs="Times New Roman"/>
-        </w:rPr>
+        <w:jc w:val="both"/>
+        <w:rPr/>
       </w:pPr>
       <w:r>
         <w:rPr>
@@ -3963,9 +3590,8 @@
         <w:pStyle w:val="Normal"/>
         <w:bidi w:val="0"/>
         <w:ind w:firstLine="850"/>
-        <w:rPr>
-          <w:rFonts w:ascii="Times New Roman" w:hAnsi="Times New Roman" w:cs="Times New Roman"/>
-        </w:rPr>
+        <w:jc w:val="both"/>
+        <w:rPr/>
       </w:pPr>
       <w:r>
         <w:rPr>
@@ -3984,9 +3610,8 @@
         <w:pStyle w:val="Normal"/>
         <w:bidi w:val="0"/>
         <w:ind w:firstLine="850"/>
-        <w:rPr>
-          <w:rFonts w:ascii="Times New Roman" w:hAnsi="Times New Roman" w:cs="Times New Roman"/>
-        </w:rPr>
+        <w:jc w:val="both"/>
+        <w:rPr/>
       </w:pPr>
       <w:r>
         <w:rPr>
@@ -4005,9 +3630,8 @@
         <w:pStyle w:val="Normal"/>
         <w:bidi w:val="0"/>
         <w:ind w:firstLine="850"/>
-        <w:rPr>
-          <w:rFonts w:ascii="Times New Roman" w:hAnsi="Times New Roman" w:cs="Times New Roman"/>
-        </w:rPr>
+        <w:jc w:val="both"/>
+        <w:rPr/>
       </w:pPr>
       <w:r>
         <w:rPr>
@@ -4026,9 +3650,8 @@
         <w:pStyle w:val="Normal"/>
         <w:bidi w:val="0"/>
         <w:ind w:firstLine="850"/>
-        <w:rPr>
-          <w:rFonts w:ascii="Times New Roman" w:hAnsi="Times New Roman" w:cs="Times New Roman"/>
-        </w:rPr>
+        <w:jc w:val="both"/>
+        <w:rPr/>
       </w:pPr>
       <w:r>
         <w:rPr>
@@ -4047,9 +3670,8 @@
         <w:pStyle w:val="Normal"/>
         <w:bidi w:val="0"/>
         <w:ind w:firstLine="850"/>
-        <w:rPr>
-          <w:rFonts w:ascii="Times New Roman" w:hAnsi="Times New Roman" w:cs="Times New Roman"/>
-        </w:rPr>
+        <w:jc w:val="both"/>
+        <w:rPr/>
       </w:pPr>
       <w:r>
         <w:rPr>
@@ -4068,9 +3690,8 @@
         <w:pStyle w:val="Normal"/>
         <w:bidi w:val="0"/>
         <w:ind w:firstLine="850"/>
-        <w:rPr>
-          <w:rFonts w:ascii="Times New Roman" w:hAnsi="Times New Roman" w:cs="Times New Roman"/>
-        </w:rPr>
+        <w:jc w:val="both"/>
+        <w:rPr/>
       </w:pPr>
       <w:r>
         <w:rPr>
@@ -4087,7 +3708,7 @@
     <w:p>
       <w:pPr>
         <w:pStyle w:val="Heading1"/>
-        <w:jc w:val="left"/>
+        <w:jc w:val="both"/>
         <w:rPr/>
       </w:pPr>
       <w:bookmarkStart w:id="15" w:name="__RefHeading___Toc948_3284332197"/>
@@ -4102,9 +3723,8 @@
         <w:pStyle w:val="Normal"/>
         <w:bidi w:val="0"/>
         <w:ind w:firstLine="850"/>
-        <w:rPr>
-          <w:rFonts w:ascii="Times New Roman" w:hAnsi="Times New Roman" w:cs="Times New Roman"/>
-        </w:rPr>
+        <w:jc w:val="both"/>
+        <w:rPr/>
       </w:pPr>
       <w:r>
         <w:rPr>
@@ -6093,6 +5713,7 @@
     <w:p>
       <w:pPr>
         <w:pStyle w:val="Table"/>
+        <w:jc w:val="both"/>
         <w:rPr/>
       </w:pPr>
       <w:r>
@@ -6129,33 +5750,32 @@
         <w:pStyle w:val="Normal"/>
         <w:bidi w:val="0"/>
         <w:ind w:hanging="0"/>
-        <w:rPr/>
-      </w:pPr>
-      <w:r>
-        <w:rPr/>
-      </w:r>
-    </w:p>
-    <w:p>
-      <w:pPr>
-        <w:pStyle w:val="Normal"/>
-        <w:bidi w:val="0"/>
-        <w:ind w:firstLine="850"/>
-        <w:rPr>
-          <w:rFonts w:ascii="Times New Roman" w:hAnsi="Times New Roman" w:cs="Times New Roman"/>
-        </w:rPr>
-      </w:pPr>
-      <w:r>
-        <w:rPr/>
-      </w:r>
-    </w:p>
-    <w:p>
-      <w:pPr>
-        <w:pStyle w:val="Normal"/>
-        <w:bidi w:val="0"/>
-        <w:ind w:firstLine="850"/>
-        <w:rPr>
-          <w:rFonts w:ascii="Times New Roman" w:hAnsi="Times New Roman" w:cs="Times New Roman"/>
-        </w:rPr>
+        <w:jc w:val="both"/>
+        <w:rPr/>
+      </w:pPr>
+      <w:r>
+        <w:rPr/>
+      </w:r>
+    </w:p>
+    <w:p>
+      <w:pPr>
+        <w:pStyle w:val="Normal"/>
+        <w:bidi w:val="0"/>
+        <w:ind w:firstLine="850"/>
+        <w:jc w:val="both"/>
+        <w:rPr/>
+      </w:pPr>
+      <w:r>
+        <w:rPr/>
+      </w:r>
+    </w:p>
+    <w:p>
+      <w:pPr>
+        <w:pStyle w:val="Normal"/>
+        <w:bidi w:val="0"/>
+        <w:ind w:firstLine="850"/>
+        <w:jc w:val="both"/>
+        <w:rPr/>
       </w:pPr>
       <w:r>
         <w:rPr>
@@ -6172,7 +5792,7 @@
     <w:p>
       <w:pPr>
         <w:pStyle w:val="Heading1"/>
-        <w:jc w:val="left"/>
+        <w:jc w:val="both"/>
         <w:rPr/>
       </w:pPr>
       <w:bookmarkStart w:id="16" w:name="__RefHeading___Toc950_3284332197"/>
@@ -6187,9 +5807,8 @@
         <w:pStyle w:val="Normal"/>
         <w:bidi w:val="0"/>
         <w:ind w:firstLine="850"/>
-        <w:rPr>
-          <w:rFonts w:ascii="Times New Roman" w:hAnsi="Times New Roman" w:cs="Times New Roman"/>
-        </w:rPr>
+        <w:jc w:val="both"/>
+        <w:rPr/>
       </w:pPr>
       <w:r>
         <w:rPr>
@@ -6208,9 +5827,8 @@
         <w:pStyle w:val="Normal"/>
         <w:bidi w:val="0"/>
         <w:ind w:firstLine="850"/>
-        <w:rPr>
-          <w:rFonts w:ascii="Times New Roman" w:hAnsi="Times New Roman" w:cs="Times New Roman"/>
-        </w:rPr>
+        <w:jc w:val="both"/>
+        <w:rPr/>
       </w:pPr>
       <w:r>
         <w:rPr>
@@ -6229,9 +5847,8 @@
         <w:pStyle w:val="Normal"/>
         <w:bidi w:val="0"/>
         <w:ind w:firstLine="850"/>
-        <w:rPr>
-          <w:rFonts w:ascii="Times New Roman" w:hAnsi="Times New Roman" w:cs="Times New Roman"/>
-        </w:rPr>
+        <w:jc w:val="both"/>
+        <w:rPr/>
       </w:pPr>
       <w:r>
         <w:rPr>
@@ -6250,9 +5867,8 @@
         <w:pStyle w:val="Normal"/>
         <w:bidi w:val="0"/>
         <w:ind w:firstLine="850"/>
-        <w:rPr>
-          <w:rFonts w:ascii="Times New Roman" w:hAnsi="Times New Roman" w:cs="Times New Roman"/>
-        </w:rPr>
+        <w:jc w:val="both"/>
+        <w:rPr/>
       </w:pPr>
       <w:r>
         <w:rPr>
@@ -6271,9 +5887,8 @@
         <w:pStyle w:val="Normal"/>
         <w:bidi w:val="0"/>
         <w:ind w:firstLine="850"/>
-        <w:rPr>
-          <w:rFonts w:ascii="Times New Roman" w:hAnsi="Times New Roman" w:cs="Times New Roman"/>
-        </w:rPr>
+        <w:jc w:val="both"/>
+        <w:rPr/>
       </w:pPr>
       <w:r>
         <w:rPr>
@@ -6292,9 +5907,8 @@
         <w:pStyle w:val="Normal"/>
         <w:bidi w:val="0"/>
         <w:ind w:firstLine="850"/>
-        <w:rPr>
-          <w:rFonts w:ascii="Times New Roman" w:hAnsi="Times New Roman" w:cs="Times New Roman"/>
-        </w:rPr>
+        <w:jc w:val="both"/>
+        <w:rPr/>
       </w:pPr>
       <w:r>
         <w:rPr>
@@ -6311,7 +5925,7 @@
     <w:p>
       <w:pPr>
         <w:pStyle w:val="Heading1"/>
-        <w:jc w:val="left"/>
+        <w:jc w:val="both"/>
         <w:rPr/>
       </w:pPr>
       <w:r>
@@ -6321,7 +5935,7 @@
     <w:p>
       <w:pPr>
         <w:pStyle w:val="Heading1"/>
-        <w:jc w:val="left"/>
+        <w:jc w:val="both"/>
         <w:rPr/>
       </w:pPr>
       <w:bookmarkStart w:id="17" w:name="__RefHeading___Toc952_3284332197"/>
@@ -6336,9 +5950,8 @@
         <w:pStyle w:val="Normal"/>
         <w:bidi w:val="0"/>
         <w:ind w:firstLine="850"/>
-        <w:rPr>
-          <w:rFonts w:ascii="Times New Roman" w:hAnsi="Times New Roman" w:cs="Times New Roman"/>
-        </w:rPr>
+        <w:jc w:val="both"/>
+        <w:rPr/>
       </w:pPr>
       <w:r>
         <w:rPr>
@@ -6357,9 +5970,8 @@
         <w:pStyle w:val="Normal"/>
         <w:bidi w:val="0"/>
         <w:ind w:firstLine="850"/>
-        <w:rPr>
-          <w:rFonts w:ascii="Times New Roman" w:hAnsi="Times New Roman" w:cs="Times New Roman"/>
-        </w:rPr>
+        <w:jc w:val="both"/>
+        <w:rPr/>
       </w:pPr>
       <w:r>
         <w:rPr>
@@ -6378,9 +5990,8 @@
         <w:pStyle w:val="Normal"/>
         <w:bidi w:val="0"/>
         <w:ind w:firstLine="850"/>
-        <w:rPr>
-          <w:rFonts w:ascii="Times New Roman" w:hAnsi="Times New Roman" w:cs="Times New Roman"/>
-        </w:rPr>
+        <w:jc w:val="both"/>
+        <w:rPr/>
       </w:pPr>
       <w:r>
         <w:rPr>
@@ -6399,9 +6010,8 @@
         <w:pStyle w:val="Normal"/>
         <w:bidi w:val="0"/>
         <w:ind w:firstLine="850"/>
-        <w:rPr>
-          <w:rFonts w:ascii="Times New Roman" w:hAnsi="Times New Roman" w:cs="Times New Roman"/>
-        </w:rPr>
+        <w:jc w:val="both"/>
+        <w:rPr/>
       </w:pPr>
       <w:r>
         <w:rPr>
@@ -6420,9 +6030,8 @@
         <w:pStyle w:val="Normal"/>
         <w:bidi w:val="0"/>
         <w:ind w:firstLine="850"/>
-        <w:rPr>
-          <w:rFonts w:ascii="Times New Roman" w:hAnsi="Times New Roman" w:cs="Times New Roman"/>
-        </w:rPr>
+        <w:jc w:val="both"/>
+        <w:rPr/>
       </w:pPr>
       <w:r>
         <w:rPr>
@@ -6441,9 +6050,8 @@
         <w:pStyle w:val="Normal"/>
         <w:bidi w:val="0"/>
         <w:ind w:firstLine="850"/>
-        <w:rPr>
-          <w:rFonts w:ascii="Times New Roman" w:hAnsi="Times New Roman" w:cs="Times New Roman"/>
-        </w:rPr>
+        <w:jc w:val="both"/>
+        <w:rPr/>
       </w:pPr>
       <w:r>
         <w:rPr>
@@ -6461,7 +6069,7 @@
       <w:pPr>
         <w:pStyle w:val="Heading1"/>
         <w:ind w:hanging="0" w:left="0"/>
-        <w:jc w:val="left"/>
+        <w:jc w:val="both"/>
         <w:rPr/>
       </w:pPr>
       <w:bookmarkStart w:id="18" w:name="__RefHeading___Toc1125_1138037686"/>
@@ -6476,9 +6084,8 @@
         <w:pStyle w:val="Normal"/>
         <w:bidi w:val="0"/>
         <w:ind w:firstLine="850"/>
-        <w:rPr>
-          <w:rFonts w:ascii="Times New Roman" w:hAnsi="Times New Roman" w:cs="Times New Roman"/>
-        </w:rPr>
+        <w:jc w:val="both"/>
+        <w:rPr/>
       </w:pPr>
       <w:r>
         <w:rPr>
@@ -6497,6 +6104,7 @@
         <w:pStyle w:val="Normal"/>
         <w:bidi w:val="0"/>
         <w:ind w:hanging="0"/>
+        <w:jc w:val="both"/>
         <w:rPr/>
       </w:pPr>
       <w:r>
@@ -6506,7 +6114,7 @@
     <w:p>
       <w:pPr>
         <w:pStyle w:val="Heading1"/>
-        <w:jc w:val="left"/>
+        <w:jc w:val="both"/>
         <w:rPr/>
       </w:pPr>
       <w:bookmarkStart w:id="19" w:name="__RefHeading___Toc1008_3284332197"/>
@@ -6521,9 +6129,8 @@
         <w:pStyle w:val="Normal"/>
         <w:bidi w:val="0"/>
         <w:ind w:firstLine="850"/>
-        <w:rPr>
-          <w:rFonts w:ascii="Times New Roman" w:hAnsi="Times New Roman" w:cs="Times New Roman"/>
-        </w:rPr>
+        <w:jc w:val="both"/>
+        <w:rPr/>
       </w:pPr>
       <w:r>
         <w:rPr>
@@ -6542,9 +6149,8 @@
         <w:pStyle w:val="Normal"/>
         <w:bidi w:val="0"/>
         <w:ind w:firstLine="850"/>
-        <w:rPr>
-          <w:rFonts w:ascii="Times New Roman" w:hAnsi="Times New Roman" w:cs="Times New Roman"/>
-        </w:rPr>
+        <w:jc w:val="both"/>
+        <w:rPr/>
       </w:pPr>
       <w:r>
         <w:rPr>
@@ -6563,9 +6169,8 @@
         <w:pStyle w:val="Normal"/>
         <w:bidi w:val="0"/>
         <w:ind w:firstLine="850"/>
-        <w:rPr>
-          <w:rFonts w:ascii="Times New Roman" w:hAnsi="Times New Roman" w:cs="Times New Roman"/>
-        </w:rPr>
+        <w:jc w:val="both"/>
+        <w:rPr/>
       </w:pPr>
       <w:r>
         <w:rPr>
@@ -6584,9 +6189,8 @@
         <w:pStyle w:val="Normal"/>
         <w:bidi w:val="0"/>
         <w:ind w:firstLine="850"/>
-        <w:rPr>
-          <w:rFonts w:ascii="Times New Roman" w:hAnsi="Times New Roman" w:cs="Times New Roman"/>
-        </w:rPr>
+        <w:jc w:val="both"/>
+        <w:rPr/>
       </w:pPr>
       <w:r>
         <w:rPr>
@@ -6605,9 +6209,8 @@
         <w:pStyle w:val="Normal"/>
         <w:bidi w:val="0"/>
         <w:ind w:firstLine="850"/>
-        <w:rPr>
-          <w:rFonts w:ascii="Times New Roman" w:hAnsi="Times New Roman" w:cs="Times New Roman"/>
-        </w:rPr>
+        <w:jc w:val="both"/>
+        <w:rPr/>
       </w:pPr>
       <w:r>
         <w:rPr>
@@ -6624,7 +6227,7 @@
     <w:p>
       <w:pPr>
         <w:pStyle w:val="Heading1"/>
-        <w:jc w:val="left"/>
+        <w:jc w:val="both"/>
         <w:rPr/>
       </w:pPr>
       <w:bookmarkStart w:id="20" w:name="__RefHeading___Toc1010_3284332197"/>
@@ -6639,9 +6242,8 @@
         <w:pStyle w:val="Normal"/>
         <w:bidi w:val="0"/>
         <w:ind w:firstLine="850"/>
-        <w:rPr>
-          <w:rFonts w:ascii="Times New Roman" w:hAnsi="Times New Roman" w:cs="Times New Roman"/>
-        </w:rPr>
+        <w:jc w:val="both"/>
+        <w:rPr/>
       </w:pPr>
       <w:r>
         <w:rPr>
@@ -6660,9 +6262,8 @@
         <w:pStyle w:val="Normal"/>
         <w:bidi w:val="0"/>
         <w:ind w:firstLine="850"/>
-        <w:rPr>
-          <w:rFonts w:ascii="Times New Roman" w:hAnsi="Times New Roman" w:cs="Times New Roman"/>
-        </w:rPr>
+        <w:jc w:val="both"/>
+        <w:rPr/>
       </w:pPr>
       <w:r>
         <w:rPr>
@@ -6681,9 +6282,8 @@
         <w:pStyle w:val="Normal"/>
         <w:bidi w:val="0"/>
         <w:ind w:firstLine="850"/>
-        <w:rPr>
-          <w:rFonts w:ascii="Times New Roman" w:hAnsi="Times New Roman" w:cs="Times New Roman"/>
-        </w:rPr>
+        <w:jc w:val="both"/>
+        <w:rPr/>
       </w:pPr>
       <w:r>
         <w:rPr>
@@ -6702,9 +6302,8 @@
         <w:pStyle w:val="Normal"/>
         <w:bidi w:val="0"/>
         <w:ind w:firstLine="850"/>
-        <w:rPr>
-          <w:rFonts w:ascii="Times New Roman" w:hAnsi="Times New Roman" w:cs="Times New Roman"/>
-        </w:rPr>
+        <w:jc w:val="both"/>
+        <w:rPr/>
       </w:pPr>
       <w:r>
         <w:rPr>
@@ -6723,9 +6322,8 @@
         <w:pStyle w:val="Normal"/>
         <w:bidi w:val="0"/>
         <w:ind w:firstLine="850"/>
-        <w:rPr>
-          <w:rFonts w:ascii="Times New Roman" w:hAnsi="Times New Roman" w:cs="Times New Roman"/>
-        </w:rPr>
+        <w:jc w:val="both"/>
+        <w:rPr/>
       </w:pPr>
       <w:r>
         <w:rPr>
@@ -6742,7 +6340,7 @@
     <w:p>
       <w:pPr>
         <w:pStyle w:val="Heading1"/>
-        <w:jc w:val="left"/>
+        <w:jc w:val="both"/>
         <w:rPr/>
       </w:pPr>
       <w:bookmarkStart w:id="21" w:name="__RefHeading___Toc1012_3284332197"/>
@@ -6757,9 +6355,8 @@
         <w:pStyle w:val="Normal"/>
         <w:bidi w:val="0"/>
         <w:ind w:firstLine="850"/>
-        <w:rPr>
-          <w:rFonts w:ascii="Times New Roman" w:hAnsi="Times New Roman" w:cs="Times New Roman"/>
-        </w:rPr>
+        <w:jc w:val="both"/>
+        <w:rPr/>
       </w:pPr>
       <w:r>
         <w:rPr>
@@ -6778,9 +6375,8 @@
         <w:pStyle w:val="Normal"/>
         <w:bidi w:val="0"/>
         <w:ind w:firstLine="850"/>
-        <w:rPr>
-          <w:rFonts w:ascii="Times New Roman" w:hAnsi="Times New Roman" w:cs="Times New Roman"/>
-        </w:rPr>
+        <w:jc w:val="both"/>
+        <w:rPr/>
       </w:pPr>
       <w:r>
         <w:rPr>
@@ -6799,9 +6395,8 @@
         <w:pStyle w:val="Normal"/>
         <w:bidi w:val="0"/>
         <w:ind w:firstLine="850"/>
-        <w:rPr>
-          <w:rFonts w:ascii="Times New Roman" w:hAnsi="Times New Roman" w:cs="Times New Roman"/>
-        </w:rPr>
+        <w:jc w:val="both"/>
+        <w:rPr/>
       </w:pPr>
       <w:r>
         <w:rPr>
@@ -6820,9 +6415,8 @@
         <w:pStyle w:val="Normal"/>
         <w:bidi w:val="0"/>
         <w:ind w:firstLine="850"/>
-        <w:rPr>
-          <w:rFonts w:ascii="Times New Roman" w:hAnsi="Times New Roman" w:cs="Times New Roman"/>
-        </w:rPr>
+        <w:jc w:val="both"/>
+        <w:rPr/>
       </w:pPr>
       <w:r>
         <w:rPr>
@@ -6841,9 +6435,8 @@
         <w:pStyle w:val="Normal"/>
         <w:bidi w:val="0"/>
         <w:ind w:firstLine="850"/>
-        <w:rPr>
-          <w:rFonts w:ascii="Times New Roman" w:hAnsi="Times New Roman" w:cs="Times New Roman"/>
-        </w:rPr>
+        <w:jc w:val="both"/>
+        <w:rPr/>
       </w:pPr>
       <w:r>
         <w:rPr>
@@ -6860,7 +6453,7 @@
     <w:p>
       <w:pPr>
         <w:pStyle w:val="Heading1"/>
-        <w:jc w:val="left"/>
+        <w:jc w:val="both"/>
         <w:rPr/>
       </w:pPr>
       <w:bookmarkStart w:id="22" w:name="__RefHeading___Toc1014_3284332197"/>
@@ -6875,9 +6468,8 @@
         <w:pStyle w:val="Normal"/>
         <w:bidi w:val="0"/>
         <w:ind w:firstLine="850"/>
-        <w:rPr>
-          <w:rFonts w:ascii="Times New Roman" w:hAnsi="Times New Roman" w:cs="Times New Roman"/>
-        </w:rPr>
+        <w:jc w:val="both"/>
+        <w:rPr/>
       </w:pPr>
       <w:r>
         <w:rPr>
@@ -6896,9 +6488,8 @@
         <w:pStyle w:val="Normal"/>
         <w:bidi w:val="0"/>
         <w:ind w:firstLine="850"/>
-        <w:rPr>
-          <w:rFonts w:ascii="Times New Roman" w:hAnsi="Times New Roman" w:cs="Times New Roman"/>
-        </w:rPr>
+        <w:jc w:val="both"/>
+        <w:rPr/>
       </w:pPr>
       <w:r>
         <w:rPr>
@@ -6917,9 +6508,8 @@
         <w:pStyle w:val="Normal"/>
         <w:bidi w:val="0"/>
         <w:ind w:firstLine="850"/>
-        <w:rPr>
-          <w:rFonts w:ascii="Times New Roman" w:hAnsi="Times New Roman" w:cs="Times New Roman"/>
-        </w:rPr>
+        <w:jc w:val="both"/>
+        <w:rPr/>
       </w:pPr>
       <w:r>
         <w:rPr>
@@ -6938,9 +6528,8 @@
         <w:pStyle w:val="Normal"/>
         <w:bidi w:val="0"/>
         <w:ind w:firstLine="850"/>
-        <w:rPr>
-          <w:rFonts w:ascii="Times New Roman" w:hAnsi="Times New Roman" w:cs="Times New Roman"/>
-        </w:rPr>
+        <w:jc w:val="both"/>
+        <w:rPr/>
       </w:pPr>
       <w:r>
         <w:rPr>
@@ -6957,7 +6546,7 @@
     <w:p>
       <w:pPr>
         <w:pStyle w:val="Heading1"/>
-        <w:jc w:val="left"/>
+        <w:jc w:val="both"/>
         <w:rPr/>
       </w:pPr>
       <w:bookmarkStart w:id="23" w:name="__RefHeading___Toc1016_3284332197"/>
@@ -6972,9 +6561,8 @@
         <w:pStyle w:val="Normal"/>
         <w:bidi w:val="0"/>
         <w:ind w:firstLine="850"/>
-        <w:rPr>
-          <w:rFonts w:ascii="Times New Roman" w:hAnsi="Times New Roman" w:cs="Times New Roman"/>
-        </w:rPr>
+        <w:jc w:val="both"/>
+        <w:rPr/>
       </w:pPr>
       <w:r>
         <w:rPr>
@@ -6993,9 +6581,8 @@
         <w:pStyle w:val="Normal"/>
         <w:bidi w:val="0"/>
         <w:ind w:firstLine="850"/>
-        <w:rPr>
-          <w:rFonts w:ascii="Times New Roman" w:hAnsi="Times New Roman" w:cs="Times New Roman"/>
-        </w:rPr>
+        <w:jc w:val="both"/>
+        <w:rPr/>
       </w:pPr>
       <w:r>
         <w:rPr>
@@ -7014,9 +6601,8 @@
         <w:pStyle w:val="Normal"/>
         <w:bidi w:val="0"/>
         <w:ind w:firstLine="850"/>
-        <w:rPr>
-          <w:rFonts w:ascii="Times New Roman" w:hAnsi="Times New Roman" w:cs="Times New Roman"/>
-        </w:rPr>
+        <w:jc w:val="both"/>
+        <w:rPr/>
       </w:pPr>
       <w:r>
         <w:rPr>
@@ -7035,9 +6621,8 @@
         <w:pStyle w:val="Normal"/>
         <w:bidi w:val="0"/>
         <w:ind w:firstLine="850"/>
-        <w:rPr>
-          <w:rFonts w:ascii="Times New Roman" w:hAnsi="Times New Roman" w:cs="Times New Roman"/>
-        </w:rPr>
+        <w:jc w:val="both"/>
+        <w:rPr/>
       </w:pPr>
       <w:r>
         <w:rPr>
@@ -7056,9 +6641,8 @@
         <w:pStyle w:val="Normal"/>
         <w:bidi w:val="0"/>
         <w:ind w:firstLine="850"/>
-        <w:rPr>
-          <w:rFonts w:ascii="Times New Roman" w:hAnsi="Times New Roman" w:cs="Times New Roman"/>
-        </w:rPr>
+        <w:jc w:val="both"/>
+        <w:rPr/>
       </w:pPr>
       <w:r>
         <w:rPr>
@@ -7075,7 +6659,7 @@
     <w:p>
       <w:pPr>
         <w:pStyle w:val="Heading1"/>
-        <w:jc w:val="left"/>
+        <w:jc w:val="both"/>
         <w:rPr/>
       </w:pPr>
       <w:bookmarkStart w:id="24" w:name="__RefHeading___Toc1018_3284332197"/>
@@ -7090,9 +6674,8 @@
         <w:pStyle w:val="Normal"/>
         <w:bidi w:val="0"/>
         <w:ind w:firstLine="850"/>
-        <w:rPr>
-          <w:rFonts w:ascii="Times New Roman" w:hAnsi="Times New Roman" w:cs="Times New Roman"/>
-        </w:rPr>
+        <w:jc w:val="both"/>
+        <w:rPr/>
       </w:pPr>
       <w:r>
         <w:rPr>
@@ -7111,9 +6694,8 @@
         <w:pStyle w:val="Normal"/>
         <w:bidi w:val="0"/>
         <w:ind w:firstLine="850"/>
-        <w:rPr>
-          <w:rFonts w:ascii="Times New Roman" w:hAnsi="Times New Roman" w:cs="Times New Roman"/>
-        </w:rPr>
+        <w:jc w:val="both"/>
+        <w:rPr/>
       </w:pPr>
       <w:r>
         <w:rPr>
@@ -7132,9 +6714,8 @@
         <w:pStyle w:val="Normal"/>
         <w:bidi w:val="0"/>
         <w:ind w:firstLine="850"/>
-        <w:rPr>
-          <w:rFonts w:ascii="Times New Roman" w:hAnsi="Times New Roman" w:cs="Times New Roman"/>
-        </w:rPr>
+        <w:jc w:val="both"/>
+        <w:rPr/>
       </w:pPr>
       <w:r>
         <w:rPr>
@@ -7153,9 +6734,8 @@
         <w:pStyle w:val="Normal"/>
         <w:bidi w:val="0"/>
         <w:ind w:firstLine="850"/>
-        <w:rPr>
-          <w:rFonts w:ascii="Times New Roman" w:hAnsi="Times New Roman" w:cs="Times New Roman"/>
-        </w:rPr>
+        <w:jc w:val="both"/>
+        <w:rPr/>
       </w:pPr>
       <w:r>
         <w:rPr>
@@ -8397,7 +7977,7 @@
       <w:pPr>
         <w:pStyle w:val="Heading1"/>
         <w:ind w:hanging="0" w:left="0"/>
-        <w:jc w:val="left"/>
+        <w:jc w:val="both"/>
         <w:rPr/>
       </w:pPr>
       <w:bookmarkStart w:id="25" w:name="__RefHeading___Toc1020_3284332197"/>
@@ -8412,9 +7992,8 @@
         <w:pStyle w:val="Normal"/>
         <w:bidi w:val="0"/>
         <w:ind w:firstLine="850"/>
-        <w:rPr>
-          <w:rFonts w:ascii="Times New Roman" w:hAnsi="Times New Roman" w:cs="Times New Roman"/>
-        </w:rPr>
+        <w:jc w:val="both"/>
+        <w:rPr/>
       </w:pPr>
       <w:r>
         <w:rPr>
@@ -8433,9 +8012,8 @@
         <w:pStyle w:val="Normal"/>
         <w:bidi w:val="0"/>
         <w:ind w:firstLine="850"/>
-        <w:rPr>
-          <w:rFonts w:ascii="Times New Roman" w:hAnsi="Times New Roman" w:cs="Times New Roman"/>
-        </w:rPr>
+        <w:jc w:val="both"/>
+        <w:rPr/>
       </w:pPr>
       <w:r>
         <w:rPr>
@@ -8721,10 +8299,8 @@
         <w:bidi w:val="0"/>
         <w:spacing w:before="0" w:after="280"/>
         <w:ind w:hanging="0" w:left="0"/>
-        <w:jc w:val="left"/>
-        <w:rPr>
-          <w:lang w:val="en-US"/>
-        </w:rPr>
+        <w:jc w:val="both"/>
+        <w:rPr/>
       </w:pPr>
       <w:bookmarkStart w:id="26" w:name="__RefHeading___Toc378_1229224459"/>
       <w:bookmarkEnd w:id="26"/>
@@ -8757,7 +8333,7 @@
         <w:pStyle w:val="Normal"/>
         <w:bidi w:val="0"/>
         <w:ind w:firstLine="850"/>
-        <w:jc w:val="left"/>
+        <w:jc w:val="both"/>
         <w:rPr/>
       </w:pPr>
       <w:r>
@@ -8770,7 +8346,7 @@
         <w:pStyle w:val="Normal"/>
         <w:bidi w:val="0"/>
         <w:ind w:firstLine="850"/>
-        <w:jc w:val="left"/>
+        <w:jc w:val="both"/>
         <w:rPr/>
       </w:pPr>
       <w:r>
@@ -8783,7 +8359,7 @@
         <w:pStyle w:val="Normal"/>
         <w:bidi w:val="0"/>
         <w:ind w:firstLine="850"/>
-        <w:jc w:val="left"/>
+        <w:jc w:val="both"/>
         <w:rPr/>
       </w:pPr>
       <w:r>
@@ -9373,7 +8949,7 @@
       <w:pPr>
         <w:pStyle w:val="Heading1"/>
         <w:ind w:hanging="0" w:left="0"/>
-        <w:jc w:val="left"/>
+        <w:jc w:val="both"/>
         <w:rPr/>
       </w:pPr>
       <w:bookmarkStart w:id="29" w:name="__RefHeading___Toc380_1229224459"/>
@@ -9388,7 +8964,7 @@
         <w:pStyle w:val="Normal"/>
         <w:bidi w:val="0"/>
         <w:ind w:firstLine="850"/>
-        <w:jc w:val="left"/>
+        <w:jc w:val="both"/>
         <w:rPr/>
       </w:pPr>
       <w:r>
@@ -9401,7 +8977,7 @@
         <w:pStyle w:val="Normal"/>
         <w:bidi w:val="0"/>
         <w:ind w:firstLine="850"/>
-        <w:jc w:val="left"/>
+        <w:jc w:val="both"/>
         <w:rPr/>
       </w:pPr>
       <w:r>
@@ -9414,7 +8990,7 @@
         <w:pStyle w:val="Normal"/>
         <w:bidi w:val="0"/>
         <w:ind w:firstLine="850"/>
-        <w:jc w:val="left"/>
+        <w:jc w:val="both"/>
         <w:rPr/>
       </w:pPr>
       <w:r>
@@ -9428,10 +9004,8 @@
         <w:bidi w:val="0"/>
         <w:spacing w:before="0" w:after="280"/>
         <w:ind w:hanging="0" w:left="0"/>
-        <w:jc w:val="left"/>
-        <w:rPr>
-          <w:lang w:val="en-US"/>
-        </w:rPr>
+        <w:jc w:val="both"/>
+        <w:rPr/>
       </w:pPr>
       <w:bookmarkStart w:id="30" w:name="__RefHeading___Toc382_1229224459"/>
       <w:bookmarkEnd w:id="30"/>
@@ -9464,7 +9038,7 @@
         <w:pStyle w:val="Normal"/>
         <w:bidi w:val="0"/>
         <w:ind w:firstLine="850"/>
-        <w:jc w:val="left"/>
+        <w:jc w:val="both"/>
         <w:rPr/>
       </w:pPr>
       <w:r>
@@ -9477,7 +9051,7 @@
         <w:pStyle w:val="Normal"/>
         <w:bidi w:val="0"/>
         <w:ind w:firstLine="850"/>
-        <w:jc w:val="left"/>
+        <w:jc w:val="both"/>
         <w:rPr/>
       </w:pPr>
       <w:r>
@@ -9490,7 +9064,7 @@
         <w:pStyle w:val="Normal"/>
         <w:bidi w:val="0"/>
         <w:ind w:firstLine="850"/>
-        <w:jc w:val="left"/>
+        <w:jc w:val="both"/>
         <w:rPr/>
       </w:pPr>
       <w:r>
@@ -9503,7 +9077,7 @@
         <w:pStyle w:val="Normal"/>
         <w:bidi w:val="0"/>
         <w:ind w:firstLine="850"/>
-        <w:jc w:val="left"/>
+        <w:jc w:val="both"/>
         <w:rPr/>
       </w:pPr>
       <w:r>
@@ -9516,7 +9090,7 @@
         <w:pStyle w:val="Normal"/>
         <w:bidi w:val="0"/>
         <w:ind w:firstLine="850"/>
-        <w:jc w:val="left"/>
+        <w:jc w:val="both"/>
         <w:rPr/>
       </w:pPr>
       <w:r>
@@ -9529,7 +9103,7 @@
         <w:pStyle w:val="Normal"/>
         <w:bidi w:val="0"/>
         <w:ind w:firstLine="850"/>
-        <w:jc w:val="left"/>
+        <w:jc w:val="both"/>
         <w:rPr/>
       </w:pPr>
       <w:r>
@@ -9542,7 +9116,7 @@
         <w:pStyle w:val="Normal"/>
         <w:bidi w:val="0"/>
         <w:ind w:firstLine="850"/>
-        <w:jc w:val="left"/>
+        <w:jc w:val="both"/>
         <w:rPr/>
       </w:pPr>
       <w:r>
@@ -9555,7 +9129,7 @@
         <w:pStyle w:val="Normal"/>
         <w:bidi w:val="0"/>
         <w:ind w:firstLine="850"/>
-        <w:jc w:val="left"/>
+        <w:jc w:val="both"/>
         <w:rPr/>
       </w:pPr>
       <w:r>
@@ -9568,7 +9142,7 @@
         <w:pStyle w:val="Normal"/>
         <w:bidi w:val="0"/>
         <w:ind w:firstLine="850"/>
-        <w:jc w:val="left"/>
+        <w:jc w:val="both"/>
         <w:rPr/>
       </w:pPr>
       <w:r>
@@ -9581,7 +9155,7 @@
         <w:pStyle w:val="Normal"/>
         <w:bidi w:val="0"/>
         <w:ind w:firstLine="850"/>
-        <w:jc w:val="left"/>
+        <w:jc w:val="both"/>
         <w:rPr/>
       </w:pPr>
       <w:r>
@@ -9594,7 +9168,7 @@
         <w:pStyle w:val="Normal"/>
         <w:bidi w:val="0"/>
         <w:ind w:firstLine="850"/>
-        <w:jc w:val="left"/>
+        <w:jc w:val="both"/>
         <w:rPr/>
       </w:pPr>
       <w:r>
@@ -9868,7 +9442,7 @@
         <w:pStyle w:val="Normal"/>
         <w:bidi w:val="0"/>
         <w:ind w:firstLine="850"/>
-        <w:jc w:val="left"/>
+        <w:jc w:val="both"/>
         <w:rPr/>
       </w:pPr>
       <w:r>
@@ -9880,7 +9454,7 @@
       <w:pPr>
         <w:pStyle w:val="Heading1"/>
         <w:ind w:hanging="0" w:left="0"/>
-        <w:jc w:val="left"/>
+        <w:jc w:val="both"/>
         <w:rPr/>
       </w:pPr>
       <w:bookmarkStart w:id="33" w:name="__RefHeading___Toc325_1892930848"/>
@@ -9895,7 +9469,7 @@
         <w:pStyle w:val="Normal"/>
         <w:bidi w:val="0"/>
         <w:ind w:firstLine="850"/>
-        <w:jc w:val="left"/>
+        <w:jc w:val="both"/>
         <w:rPr/>
       </w:pPr>
       <w:r>
@@ -9908,7 +9482,7 @@
         <w:pStyle w:val="Normal"/>
         <w:bidi w:val="0"/>
         <w:ind w:firstLine="850"/>
-        <w:jc w:val="left"/>
+        <w:jc w:val="both"/>
         <w:rPr/>
       </w:pPr>
       <w:r>
@@ -9921,7 +9495,7 @@
         <w:pStyle w:val="Normal"/>
         <w:bidi w:val="0"/>
         <w:ind w:firstLine="850"/>
-        <w:jc w:val="left"/>
+        <w:jc w:val="both"/>
         <w:rPr/>
       </w:pPr>
       <w:r>
@@ -9934,7 +9508,7 @@
         <w:pStyle w:val="Normal"/>
         <w:bidi w:val="0"/>
         <w:ind w:firstLine="850"/>
-        <w:jc w:val="left"/>
+        <w:jc w:val="both"/>
         <w:rPr/>
       </w:pPr>
       <w:r>
@@ -9947,7 +9521,7 @@
         <w:pStyle w:val="Normal"/>
         <w:bidi w:val="0"/>
         <w:ind w:firstLine="850"/>
-        <w:jc w:val="left"/>
+        <w:jc w:val="both"/>
         <w:rPr/>
       </w:pPr>
       <w:r>
@@ -9960,7 +9534,7 @@
         <w:pStyle w:val="Normal"/>
         <w:bidi w:val="0"/>
         <w:ind w:firstLine="850"/>
-        <w:jc w:val="left"/>
+        <w:jc w:val="both"/>
         <w:rPr/>
       </w:pPr>
       <w:r>
@@ -9973,7 +9547,7 @@
         <w:pStyle w:val="Normal"/>
         <w:bidi w:val="0"/>
         <w:ind w:firstLine="850"/>
-        <w:jc w:val="left"/>
+        <w:jc w:val="both"/>
         <w:rPr/>
       </w:pPr>
       <w:r>
@@ -9986,7 +9560,7 @@
         <w:pStyle w:val="Normal"/>
         <w:bidi w:val="0"/>
         <w:ind w:firstLine="850"/>
-        <w:jc w:val="left"/>
+        <w:jc w:val="both"/>
         <w:rPr/>
       </w:pPr>
       <w:r>
@@ -9999,7 +9573,7 @@
         <w:pStyle w:val="Normal"/>
         <w:bidi w:val="0"/>
         <w:ind w:firstLine="850"/>
-        <w:jc w:val="left"/>
+        <w:jc w:val="both"/>
         <w:rPr/>
       </w:pPr>
       <w:r>
@@ -10012,7 +9586,7 @@
         <w:pStyle w:val="Normal"/>
         <w:bidi w:val="0"/>
         <w:ind w:firstLine="850"/>
-        <w:jc w:val="left"/>
+        <w:jc w:val="both"/>
         <w:rPr/>
       </w:pPr>
       <w:r>
@@ -10025,7 +9599,7 @@
         <w:pStyle w:val="Normal"/>
         <w:bidi w:val="0"/>
         <w:ind w:hanging="0"/>
-        <w:jc w:val="left"/>
+        <w:jc w:val="both"/>
         <w:rPr/>
       </w:pPr>
       <w:r>
@@ -10292,19 +9866,19 @@
         <w:pStyle w:val="Normal"/>
         <w:bidi w:val="0"/>
         <w:ind w:firstLine="850"/>
-        <w:jc w:val="left"/>
-        <w:rPr/>
-      </w:pPr>
-      <w:r>
-        <w:rPr/>
-      </w:r>
-    </w:p>
-    <w:p>
-      <w:pPr>
-        <w:pStyle w:val="Normal"/>
-        <w:bidi w:val="0"/>
-        <w:ind w:firstLine="850"/>
-        <w:jc w:val="left"/>
+        <w:jc w:val="both"/>
+        <w:rPr/>
+      </w:pPr>
+      <w:r>
+        <w:rPr/>
+      </w:r>
+    </w:p>
+    <w:p>
+      <w:pPr>
+        <w:pStyle w:val="Normal"/>
+        <w:bidi w:val="0"/>
+        <w:ind w:firstLine="850"/>
+        <w:jc w:val="both"/>
         <w:rPr/>
       </w:pPr>
       <w:r>
@@ -10317,7 +9891,7 @@
         <w:pStyle w:val="Normal"/>
         <w:bidi w:val="0"/>
         <w:ind w:firstLine="850"/>
-        <w:jc w:val="left"/>
+        <w:jc w:val="both"/>
         <w:rPr/>
       </w:pPr>
       <w:r>
@@ -10329,7 +9903,7 @@
       <w:pPr>
         <w:pStyle w:val="Heading1"/>
         <w:ind w:hanging="0" w:left="0"/>
-        <w:jc w:val="left"/>
+        <w:jc w:val="both"/>
         <w:rPr/>
       </w:pPr>
       <w:r>
@@ -10340,7 +9914,7 @@
       <w:pPr>
         <w:pStyle w:val="Heading1"/>
         <w:ind w:hanging="0" w:left="0"/>
-        <w:jc w:val="left"/>
+        <w:jc w:val="both"/>
         <w:rPr/>
       </w:pPr>
       <w:bookmarkStart w:id="34" w:name="__RefHeading___Toc320_1138037686"/>
@@ -10355,7 +9929,7 @@
         <w:pStyle w:val="Normal"/>
         <w:bidi w:val="0"/>
         <w:ind w:hanging="0"/>
-        <w:jc w:val="left"/>
+        <w:jc w:val="both"/>
         <w:rPr/>
       </w:pPr>
       <w:r>
@@ -10368,7 +9942,7 @@
       <w:pPr>
         <w:pStyle w:val="Heading1"/>
         <w:ind w:hanging="0" w:left="0"/>
-        <w:jc w:val="left"/>
+        <w:jc w:val="both"/>
         <w:rPr/>
       </w:pPr>
       <w:bookmarkStart w:id="35" w:name="__RefHeading___Toc322_1138037686"/>
@@ -10383,7 +9957,7 @@
         <w:pStyle w:val="Normal"/>
         <w:bidi w:val="0"/>
         <w:ind w:hanging="0"/>
-        <w:jc w:val="left"/>
+        <w:jc w:val="both"/>
         <w:rPr/>
       </w:pPr>
       <w:r>
@@ -10397,7 +9971,7 @@
         <w:pStyle w:val="Normal"/>
         <w:bidi w:val="0"/>
         <w:ind w:hanging="0"/>
-        <w:jc w:val="left"/>
+        <w:jc w:val="both"/>
         <w:rPr/>
       </w:pPr>
       <w:r>
@@ -10410,7 +9984,7 @@
       <w:pPr>
         <w:pStyle w:val="Heading1"/>
         <w:ind w:hanging="0" w:left="0"/>
-        <w:jc w:val="left"/>
+        <w:jc w:val="both"/>
         <w:rPr/>
       </w:pPr>
       <w:bookmarkStart w:id="36" w:name="__RefHeading___Toc324_1138037686"/>
@@ -10425,7 +9999,7 @@
         <w:pStyle w:val="Normal"/>
         <w:bidi w:val="0"/>
         <w:ind w:firstLine="850"/>
-        <w:jc w:val="left"/>
+        <w:jc w:val="both"/>
         <w:rPr/>
       </w:pPr>
       <w:r>
@@ -10438,19 +10012,19 @@
         <w:pStyle w:val="Normal"/>
         <w:bidi w:val="0"/>
         <w:ind w:firstLine="850"/>
-        <w:jc w:val="left"/>
-        <w:rPr/>
-      </w:pPr>
-      <w:r>
-        <w:rPr/>
-      </w:r>
-    </w:p>
-    <w:p>
-      <w:pPr>
-        <w:pStyle w:val="Normal"/>
-        <w:bidi w:val="0"/>
-        <w:ind w:firstLine="850"/>
-        <w:jc w:val="left"/>
+        <w:jc w:val="both"/>
+        <w:rPr/>
+      </w:pPr>
+      <w:r>
+        <w:rPr/>
+      </w:r>
+    </w:p>
+    <w:p>
+      <w:pPr>
+        <w:pStyle w:val="Normal"/>
+        <w:bidi w:val="0"/>
+        <w:ind w:firstLine="850"/>
+        <w:jc w:val="both"/>
         <w:rPr/>
       </w:pPr>
       <w:r>
@@ -10471,7 +10045,7 @@
         <w:pStyle w:val="Normal"/>
         <w:bidi w:val="0"/>
         <w:ind w:firstLine="850"/>
-        <w:jc w:val="left"/>
+        <w:jc w:val="both"/>
         <w:rPr/>
       </w:pPr>
       <w:r>
@@ -10696,7 +10270,7 @@
         <w:pStyle w:val="Normal"/>
         <w:bidi w:val="0"/>
         <w:ind w:firstLine="850"/>
-        <w:jc w:val="left"/>
+        <w:jc w:val="both"/>
         <w:rPr/>
       </w:pPr>
       <w:r>
@@ -10712,7 +10286,7 @@
       <w:pPr>
         <w:pStyle w:val="Heading1"/>
         <w:ind w:hanging="0" w:left="0"/>
-        <w:jc w:val="left"/>
+        <w:jc w:val="both"/>
         <w:rPr/>
       </w:pPr>
       <w:r>
@@ -10723,7 +10297,7 @@
       <w:pPr>
         <w:pStyle w:val="Heading1"/>
         <w:ind w:hanging="0" w:left="0"/>
-        <w:jc w:val="left"/>
+        <w:jc w:val="both"/>
         <w:rPr/>
       </w:pPr>
       <w:bookmarkStart w:id="37" w:name="__RefHeading___Toc326_1138037686"/>
@@ -10738,7 +10312,7 @@
         <w:pStyle w:val="Normal"/>
         <w:bidi w:val="0"/>
         <w:ind w:firstLine="850"/>
-        <w:jc w:val="left"/>
+        <w:jc w:val="both"/>
         <w:rPr/>
       </w:pPr>
       <w:r>
@@ -10751,7 +10325,7 @@
         <w:pStyle w:val="Normal"/>
         <w:bidi w:val="0"/>
         <w:ind w:firstLine="850"/>
-        <w:jc w:val="left"/>
+        <w:jc w:val="both"/>
         <w:rPr/>
       </w:pPr>
       <w:r>
@@ -10764,7 +10338,7 @@
         <w:pStyle w:val="Normal"/>
         <w:bidi w:val="0"/>
         <w:ind w:firstLine="850"/>
-        <w:jc w:val="left"/>
+        <w:jc w:val="both"/>
         <w:rPr/>
       </w:pPr>
       <w:r>
@@ -10989,7 +10563,7 @@
         <w:pStyle w:val="Normal"/>
         <w:bidi w:val="0"/>
         <w:ind w:firstLine="850"/>
-        <w:jc w:val="left"/>
+        <w:jc w:val="both"/>
         <w:rPr/>
       </w:pPr>
       <w:r>
@@ -11218,7 +10792,7 @@
         <w:pStyle w:val="Normal"/>
         <w:bidi w:val="0"/>
         <w:ind w:firstLine="850"/>
-        <w:jc w:val="left"/>
+        <w:jc w:val="both"/>
         <w:rPr/>
       </w:pPr>
       <w:r>
@@ -11234,7 +10808,7 @@
       <w:pPr>
         <w:pStyle w:val="Heading1"/>
         <w:ind w:hanging="0" w:left="0"/>
-        <w:jc w:val="left"/>
+        <w:jc w:val="both"/>
         <w:rPr/>
       </w:pPr>
       <w:bookmarkStart w:id="38" w:name="__RefHeading___Toc328_1138037686"/>
@@ -11249,7 +10823,7 @@
         <w:pStyle w:val="Normal"/>
         <w:bidi w:val="0"/>
         <w:ind w:firstLine="850"/>
-        <w:jc w:val="left"/>
+        <w:jc w:val="both"/>
         <w:rPr/>
       </w:pPr>
       <w:r>
@@ -11262,7 +10836,7 @@
         <w:pStyle w:val="Normal"/>
         <w:bidi w:val="0"/>
         <w:ind w:firstLine="850"/>
-        <w:jc w:val="left"/>
+        <w:jc w:val="both"/>
         <w:rPr/>
       </w:pPr>
       <w:r>
@@ -11275,7 +10849,7 @@
         <w:pStyle w:val="Normal"/>
         <w:bidi w:val="0"/>
         <w:ind w:firstLine="850"/>
-        <w:jc w:val="left"/>
+        <w:jc w:val="both"/>
         <w:rPr/>
       </w:pPr>
       <w:r>
@@ -11528,7 +11102,7 @@
         <w:pStyle w:val="Normal"/>
         <w:bidi w:val="0"/>
         <w:ind w:firstLine="850"/>
-        <w:jc w:val="left"/>
+        <w:jc w:val="both"/>
         <w:rPr/>
       </w:pPr>
       <w:r>
@@ -11769,7 +11343,7 @@
         <w:pStyle w:val="Normal"/>
         <w:bidi w:val="0"/>
         <w:ind w:firstLine="850"/>
-        <w:jc w:val="left"/>
+        <w:jc w:val="both"/>
         <w:rPr/>
       </w:pPr>
       <w:r>
@@ -11785,7 +11359,7 @@
       <w:pPr>
         <w:pStyle w:val="Heading1"/>
         <w:ind w:hanging="0" w:left="0"/>
-        <w:jc w:val="left"/>
+        <w:jc w:val="both"/>
         <w:rPr/>
       </w:pPr>
       <w:bookmarkStart w:id="39" w:name="__RefHeading___Toc330_1138037686"/>
@@ -11800,7 +11374,7 @@
         <w:pStyle w:val="Normal"/>
         <w:bidi w:val="0"/>
         <w:ind w:firstLine="850"/>
-        <w:jc w:val="left"/>
+        <w:jc w:val="both"/>
         <w:rPr/>
       </w:pPr>
       <w:r>
@@ -11813,7 +11387,7 @@
         <w:pStyle w:val="Normal"/>
         <w:bidi w:val="0"/>
         <w:ind w:firstLine="850"/>
-        <w:jc w:val="left"/>
+        <w:jc w:val="both"/>
         <w:rPr/>
       </w:pPr>
       <w:r>
@@ -11826,7 +11400,7 @@
         <w:pStyle w:val="Normal"/>
         <w:bidi w:val="0"/>
         <w:ind w:firstLine="850"/>
-        <w:jc w:val="left"/>
+        <w:jc w:val="both"/>
         <w:rPr/>
       </w:pPr>
       <w:r>
@@ -12099,7 +11673,7 @@
       <w:pPr>
         <w:pStyle w:val="Heading1"/>
         <w:ind w:hanging="0" w:left="0"/>
-        <w:jc w:val="left"/>
+        <w:jc w:val="both"/>
         <w:rPr/>
       </w:pPr>
       <w:bookmarkStart w:id="40" w:name="__RefHeading___Toc332_1138037686"/>
@@ -12114,7 +11688,7 @@
         <w:pStyle w:val="Normal"/>
         <w:bidi w:val="0"/>
         <w:ind w:firstLine="850"/>
-        <w:jc w:val="left"/>
+        <w:jc w:val="both"/>
         <w:rPr/>
       </w:pPr>
       <w:r>
@@ -12127,7 +11701,7 @@
         <w:pStyle w:val="Normal"/>
         <w:bidi w:val="0"/>
         <w:ind w:firstLine="850"/>
-        <w:jc w:val="left"/>
+        <w:jc w:val="both"/>
         <w:rPr/>
       </w:pPr>
       <w:r>
@@ -12147,7 +11721,7 @@
       <w:pPr>
         <w:pStyle w:val="Heading1"/>
         <w:ind w:hanging="0" w:left="0"/>
-        <w:jc w:val="left"/>
+        <w:jc w:val="both"/>
         <w:rPr/>
       </w:pPr>
       <w:bookmarkStart w:id="41" w:name="__RefHeading___Toc399_1138037686"/>
@@ -12162,7 +11736,7 @@
         <w:pStyle w:val="Normal"/>
         <w:bidi w:val="0"/>
         <w:ind w:firstLine="850"/>
-        <w:jc w:val="left"/>
+        <w:jc w:val="both"/>
         <w:rPr/>
       </w:pPr>
       <w:r>
@@ -12174,7 +11748,7 @@
       <w:pPr>
         <w:pStyle w:val="Heading1"/>
         <w:ind w:hanging="0" w:left="0"/>
-        <w:jc w:val="left"/>
+        <w:jc w:val="both"/>
         <w:rPr/>
       </w:pPr>
       <w:bookmarkStart w:id="42" w:name="__RefHeading___Toc401_1138037686"/>
@@ -12189,7 +11763,7 @@
         <w:pStyle w:val="Normal"/>
         <w:bidi w:val="0"/>
         <w:ind w:firstLine="850"/>
-        <w:jc w:val="left"/>
+        <w:jc w:val="both"/>
         <w:rPr/>
       </w:pPr>
       <w:r>
@@ -12202,7 +11776,7 @@
         <w:pStyle w:val="Normal"/>
         <w:bidi w:val="0"/>
         <w:ind w:firstLine="850"/>
-        <w:jc w:val="left"/>
+        <w:jc w:val="both"/>
         <w:rPr/>
       </w:pPr>
       <w:r>
@@ -12215,7 +11789,7 @@
         <w:pStyle w:val="Normal"/>
         <w:bidi w:val="0"/>
         <w:ind w:firstLine="850"/>
-        <w:jc w:val="left"/>
+        <w:jc w:val="both"/>
         <w:rPr/>
       </w:pPr>
       <w:r>
@@ -12228,7 +11802,7 @@
         <w:pStyle w:val="Normal"/>
         <w:bidi w:val="0"/>
         <w:ind w:firstLine="850"/>
-        <w:jc w:val="left"/>
+        <w:jc w:val="both"/>
         <w:rPr/>
       </w:pPr>
       <w:r>
@@ -12241,7 +11815,7 @@
         <w:pStyle w:val="Normal"/>
         <w:bidi w:val="0"/>
         <w:ind w:firstLine="850"/>
-        <w:jc w:val="left"/>
+        <w:jc w:val="both"/>
         <w:rPr/>
       </w:pPr>
       <w:r>
@@ -12254,7 +11828,7 @@
         <w:pStyle w:val="Normal"/>
         <w:bidi w:val="0"/>
         <w:ind w:firstLine="850"/>
-        <w:jc w:val="left"/>
+        <w:jc w:val="both"/>
         <w:rPr/>
       </w:pPr>
       <w:r>
@@ -12267,7 +11841,7 @@
         <w:pStyle w:val="Normal"/>
         <w:bidi w:val="0"/>
         <w:ind w:firstLine="850"/>
-        <w:jc w:val="left"/>
+        <w:jc w:val="both"/>
         <w:rPr/>
       </w:pPr>
       <w:r>
@@ -12280,7 +11854,7 @@
         <w:pStyle w:val="Normal"/>
         <w:bidi w:val="0"/>
         <w:ind w:firstLine="850"/>
-        <w:jc w:val="left"/>
+        <w:jc w:val="both"/>
         <w:rPr/>
       </w:pPr>
       <w:r>
@@ -12293,7 +11867,7 @@
         <w:pStyle w:val="Normal"/>
         <w:bidi w:val="0"/>
         <w:ind w:firstLine="850"/>
-        <w:jc w:val="left"/>
+        <w:jc w:val="both"/>
         <w:rPr/>
       </w:pPr>
       <w:r>
@@ -12305,7 +11879,7 @@
       <w:pPr>
         <w:pStyle w:val="Heading1"/>
         <w:ind w:hanging="0" w:left="0"/>
-        <w:jc w:val="left"/>
+        <w:jc w:val="both"/>
         <w:rPr/>
       </w:pPr>
       <w:bookmarkStart w:id="43" w:name="__RefHeading___Toc403_1138037686"/>
@@ -12320,7 +11894,7 @@
         <w:pStyle w:val="Normal"/>
         <w:bidi w:val="0"/>
         <w:ind w:firstLine="850"/>
-        <w:jc w:val="left"/>
+        <w:jc w:val="both"/>
         <w:rPr/>
       </w:pPr>
       <w:r>
@@ -13089,7 +12663,7 @@
         <w:pStyle w:val="Normal"/>
         <w:bidi w:val="0"/>
         <w:ind w:firstLine="850"/>
-        <w:jc w:val="left"/>
+        <w:jc w:val="both"/>
         <w:rPr/>
       </w:pPr>
       <w:r>
@@ -13101,7 +12675,7 @@
       <w:pPr>
         <w:pStyle w:val="Heading1"/>
         <w:ind w:hanging="0" w:left="0"/>
-        <w:jc w:val="left"/>
+        <w:jc w:val="both"/>
         <w:rPr/>
       </w:pPr>
       <w:bookmarkStart w:id="44" w:name="__RefHeading___Toc405_1138037686"/>
@@ -13116,7 +12690,7 @@
         <w:pStyle w:val="Normal"/>
         <w:bidi w:val="0"/>
         <w:ind w:firstLine="850"/>
-        <w:jc w:val="left"/>
+        <w:jc w:val="both"/>
         <w:rPr/>
       </w:pPr>
       <w:r>
@@ -13129,7 +12703,7 @@
         <w:pStyle w:val="Normal"/>
         <w:bidi w:val="0"/>
         <w:ind w:firstLine="850"/>
-        <w:jc w:val="left"/>
+        <w:jc w:val="both"/>
         <w:rPr/>
       </w:pPr>
       <w:r>
@@ -13142,7 +12716,7 @@
         <w:pStyle w:val="Normal"/>
         <w:bidi w:val="0"/>
         <w:ind w:firstLine="850"/>
-        <w:jc w:val="left"/>
+        <w:jc w:val="both"/>
         <w:rPr/>
       </w:pPr>
       <w:r>
@@ -13155,7 +12729,7 @@
         <w:pStyle w:val="Normal"/>
         <w:bidi w:val="0"/>
         <w:ind w:firstLine="850"/>
-        <w:jc w:val="left"/>
+        <w:jc w:val="both"/>
         <w:rPr/>
       </w:pPr>
       <w:r>
@@ -13168,7 +12742,7 @@
         <w:pStyle w:val="Normal"/>
         <w:bidi w:val="0"/>
         <w:ind w:firstLine="850"/>
-        <w:jc w:val="left"/>
+        <w:jc w:val="both"/>
         <w:rPr/>
       </w:pPr>
       <w:r>
@@ -13181,7 +12755,7 @@
         <w:pStyle w:val="Normal"/>
         <w:bidi w:val="0"/>
         <w:ind w:firstLine="850"/>
-        <w:jc w:val="left"/>
+        <w:jc w:val="both"/>
         <w:rPr/>
       </w:pPr>
       <w:r>
@@ -13194,7 +12768,7 @@
         <w:pStyle w:val="Normal"/>
         <w:bidi w:val="0"/>
         <w:ind w:firstLine="850"/>
-        <w:jc w:val="left"/>
+        <w:jc w:val="both"/>
         <w:rPr/>
       </w:pPr>
       <w:r>
@@ -13207,7 +12781,7 @@
         <w:pStyle w:val="Normal"/>
         <w:bidi w:val="0"/>
         <w:ind w:firstLine="850"/>
-        <w:jc w:val="left"/>
+        <w:jc w:val="both"/>
         <w:rPr/>
       </w:pPr>
       <w:r>
@@ -13220,7 +12794,7 @@
         <w:pStyle w:val="Normal"/>
         <w:bidi w:val="0"/>
         <w:ind w:firstLine="850"/>
-        <w:jc w:val="left"/>
+        <w:jc w:val="both"/>
         <w:rPr/>
       </w:pPr>
       <w:r>
@@ -13233,7 +12807,7 @@
         <w:pStyle w:val="Normal"/>
         <w:bidi w:val="0"/>
         <w:ind w:firstLine="850"/>
-        <w:jc w:val="left"/>
+        <w:jc w:val="both"/>
         <w:rPr/>
       </w:pPr>
       <w:r>
@@ -13246,7 +12820,7 @@
         <w:pStyle w:val="Normal"/>
         <w:bidi w:val="0"/>
         <w:ind w:firstLine="850"/>
-        <w:jc w:val="left"/>
+        <w:jc w:val="both"/>
         <w:rPr/>
       </w:pPr>
       <w:r>
@@ -13259,7 +12833,7 @@
         <w:pStyle w:val="Normal"/>
         <w:bidi w:val="0"/>
         <w:ind w:firstLine="850"/>
-        <w:jc w:val="left"/>
+        <w:jc w:val="both"/>
         <w:rPr/>
       </w:pPr>
       <w:r>
@@ -13271,7 +12845,7 @@
       <w:pPr>
         <w:pStyle w:val="Heading1"/>
         <w:ind w:hanging="0" w:left="0"/>
-        <w:jc w:val="left"/>
+        <w:jc w:val="both"/>
         <w:rPr/>
       </w:pPr>
       <w:bookmarkStart w:id="45" w:name="__RefHeading___Toc407_1138037686"/>
@@ -13286,7 +12860,7 @@
         <w:pStyle w:val="Normal"/>
         <w:bidi w:val="0"/>
         <w:ind w:firstLine="850"/>
-        <w:jc w:val="left"/>
+        <w:jc w:val="both"/>
         <w:rPr/>
       </w:pPr>
       <w:r>
@@ -13299,7 +12873,7 @@
         <w:pStyle w:val="Normal"/>
         <w:bidi w:val="0"/>
         <w:ind w:firstLine="850"/>
-        <w:jc w:val="left"/>
+        <w:jc w:val="both"/>
         <w:rPr/>
       </w:pPr>
       <w:r>
@@ -13312,24 +12886,12 @@
         <w:pStyle w:val="Normal"/>
         <w:bidi w:val="0"/>
         <w:ind w:firstLine="850"/>
-        <w:jc w:val="left"/>
+        <w:jc w:val="both"/>
         <w:rPr/>
       </w:pPr>
       <w:r>
         <w:rPr/>
         <w:t>The lifecycle event timeline is especially useful because it confirms that status transitions are recorded separately from the task row itself. A successfully completed task contains events such as CREATED, ASSIGNED, STARTED, and COMPLETED. This shows that the system not only changes task status, but also records a traceable history of execution.</w:t>
-      </w:r>
-    </w:p>
-    <w:p>
-      <w:pPr>
-        <w:pStyle w:val="Normal"/>
-        <w:bidi w:val="0"/>
-        <w:ind w:firstLine="850"/>
-        <w:jc w:val="left"/>
-        <w:rPr/>
-      </w:pPr>
-      <w:r>
-        <w:rPr/>
       </w:r>
     </w:p>
     <w:p>
@@ -13597,7 +13159,7 @@
       <w:pPr>
         <w:pStyle w:val="Heading1"/>
         <w:ind w:hanging="0" w:left="0"/>
-        <w:jc w:val="left"/>
+        <w:jc w:val="both"/>
         <w:rPr/>
       </w:pPr>
       <w:bookmarkStart w:id="46" w:name="__RefHeading___Toc409_1138037686"/>
@@ -13612,7 +13174,7 @@
         <w:pStyle w:val="Normal"/>
         <w:bidi w:val="0"/>
         <w:ind w:firstLine="850"/>
-        <w:jc w:val="left"/>
+        <w:jc w:val="both"/>
         <w:rPr/>
       </w:pPr>
       <w:r>
@@ -13625,7 +13187,7 @@
         <w:pStyle w:val="Normal"/>
         <w:bidi w:val="0"/>
         <w:ind w:firstLine="850"/>
-        <w:jc w:val="left"/>
+        <w:jc w:val="both"/>
         <w:rPr/>
       </w:pPr>
       <w:r>
@@ -13638,7 +13200,7 @@
         <w:pStyle w:val="Normal"/>
         <w:bidi w:val="0"/>
         <w:ind w:firstLine="850"/>
-        <w:jc w:val="left"/>
+        <w:jc w:val="both"/>
         <w:rPr/>
       </w:pPr>
       <w:r>
@@ -14124,7 +13686,7 @@
         <w:pStyle w:val="Normal"/>
         <w:bidi w:val="0"/>
         <w:ind w:firstLine="850"/>
-        <w:jc w:val="left"/>
+        <w:jc w:val="both"/>
         <w:rPr/>
       </w:pPr>
       <w:r>
@@ -14136,7 +13698,7 @@
       <w:pPr>
         <w:pStyle w:val="Heading1"/>
         <w:ind w:hanging="0" w:left="0"/>
-        <w:jc w:val="left"/>
+        <w:jc w:val="both"/>
         <w:rPr/>
       </w:pPr>
       <w:bookmarkStart w:id="47" w:name="__RefHeading___Toc1127_1138037686"/>
@@ -14151,7 +13713,7 @@
         <w:pStyle w:val="Normal"/>
         <w:bidi w:val="0"/>
         <w:ind w:firstLine="850"/>
-        <w:jc w:val="left"/>
+        <w:jc w:val="both"/>
         <w:rPr/>
       </w:pPr>
       <w:r>
@@ -14171,7 +13733,7 @@
       <w:pPr>
         <w:pStyle w:val="Heading1"/>
         <w:ind w:hanging="0" w:left="0"/>
-        <w:jc w:val="left"/>
+        <w:jc w:val="both"/>
         <w:rPr/>
       </w:pPr>
       <w:bookmarkStart w:id="48" w:name="__RefHeading___Toc1129_1138037686"/>
@@ -14186,7 +13748,7 @@
         <w:pStyle w:val="Normal"/>
         <w:bidi w:val="0"/>
         <w:ind w:firstLine="850"/>
-        <w:jc w:val="left"/>
+        <w:jc w:val="both"/>
         <w:rPr/>
       </w:pPr>
       <w:r>
@@ -14199,7 +13761,7 @@
         <w:pStyle w:val="Normal"/>
         <w:bidi w:val="0"/>
         <w:ind w:firstLine="850"/>
-        <w:jc w:val="left"/>
+        <w:jc w:val="both"/>
         <w:rPr/>
       </w:pPr>
       <w:r>
@@ -14212,7 +13774,7 @@
         <w:pStyle w:val="Normal"/>
         <w:bidi w:val="0"/>
         <w:ind w:firstLine="850"/>
-        <w:jc w:val="left"/>
+        <w:jc w:val="both"/>
         <w:rPr/>
       </w:pPr>
       <w:r>
@@ -14225,7 +13787,7 @@
         <w:pStyle w:val="Normal"/>
         <w:bidi w:val="0"/>
         <w:ind w:firstLine="850"/>
-        <w:jc w:val="left"/>
+        <w:jc w:val="both"/>
         <w:rPr/>
       </w:pPr>
       <w:r>
@@ -14238,7 +13800,7 @@
         <w:pStyle w:val="Normal"/>
         <w:bidi w:val="0"/>
         <w:ind w:firstLine="850"/>
-        <w:jc w:val="left"/>
+        <w:jc w:val="both"/>
         <w:rPr/>
       </w:pPr>
       <w:r>
@@ -14250,7 +13812,7 @@
       <w:pPr>
         <w:pStyle w:val="Heading1"/>
         <w:ind w:hanging="0" w:left="0"/>
-        <w:jc w:val="left"/>
+        <w:jc w:val="both"/>
         <w:rPr/>
       </w:pPr>
       <w:bookmarkStart w:id="49" w:name="__RefHeading___Toc1131_1138037686"/>
@@ -14265,7 +13827,7 @@
         <w:pStyle w:val="Normal"/>
         <w:bidi w:val="0"/>
         <w:ind w:firstLine="850"/>
-        <w:jc w:val="left"/>
+        <w:jc w:val="both"/>
         <w:rPr/>
       </w:pPr>
       <w:r>
@@ -14278,7 +13840,7 @@
         <w:pStyle w:val="Normal"/>
         <w:bidi w:val="0"/>
         <w:ind w:firstLine="850"/>
-        <w:jc w:val="left"/>
+        <w:jc w:val="both"/>
         <w:rPr/>
       </w:pPr>
       <w:r>
@@ -14291,7 +13853,7 @@
         <w:pStyle w:val="Normal"/>
         <w:bidi w:val="0"/>
         <w:ind w:firstLine="850"/>
-        <w:jc w:val="left"/>
+        <w:jc w:val="both"/>
         <w:rPr/>
       </w:pPr>
       <w:r>
@@ -14304,7 +13866,7 @@
         <w:pStyle w:val="Normal"/>
         <w:bidi w:val="0"/>
         <w:ind w:firstLine="850"/>
-        <w:jc w:val="left"/>
+        <w:jc w:val="both"/>
         <w:rPr/>
       </w:pPr>
       <w:r>
@@ -14317,7 +13879,7 @@
         <w:pStyle w:val="Normal"/>
         <w:bidi w:val="0"/>
         <w:ind w:firstLine="850"/>
-        <w:jc w:val="left"/>
+        <w:jc w:val="both"/>
         <w:rPr/>
       </w:pPr>
       <w:r>
@@ -14330,7 +13892,7 @@
         <w:pStyle w:val="Normal"/>
         <w:bidi w:val="0"/>
         <w:ind w:firstLine="850"/>
-        <w:jc w:val="left"/>
+        <w:jc w:val="both"/>
         <w:rPr/>
       </w:pPr>
       <w:r>
@@ -14342,7 +13904,7 @@
       <w:pPr>
         <w:pStyle w:val="Heading1"/>
         <w:ind w:hanging="0" w:left="0"/>
-        <w:jc w:val="left"/>
+        <w:jc w:val="both"/>
         <w:rPr/>
       </w:pPr>
       <w:bookmarkStart w:id="50" w:name="__RefHeading___Toc1133_1138037686"/>
@@ -14357,7 +13919,7 @@
         <w:pStyle w:val="Normal"/>
         <w:bidi w:val="0"/>
         <w:ind w:firstLine="850"/>
-        <w:jc w:val="left"/>
+        <w:jc w:val="both"/>
         <w:rPr/>
       </w:pPr>
       <w:r>
@@ -14370,7 +13932,7 @@
         <w:pStyle w:val="Normal"/>
         <w:bidi w:val="0"/>
         <w:ind w:firstLine="850"/>
-        <w:jc w:val="left"/>
+        <w:jc w:val="both"/>
         <w:rPr/>
       </w:pPr>
       <w:r>
@@ -14383,7 +13945,7 @@
         <w:pStyle w:val="Normal"/>
         <w:bidi w:val="0"/>
         <w:ind w:firstLine="850"/>
-        <w:jc w:val="left"/>
+        <w:jc w:val="both"/>
         <w:rPr/>
       </w:pPr>
       <w:r>
@@ -14396,7 +13958,7 @@
         <w:pStyle w:val="Normal"/>
         <w:bidi w:val="0"/>
         <w:ind w:firstLine="850"/>
-        <w:jc w:val="left"/>
+        <w:jc w:val="both"/>
         <w:rPr/>
       </w:pPr>
       <w:r>
@@ -14409,19 +13971,19 @@
         <w:pStyle w:val="Normal"/>
         <w:bidi w:val="0"/>
         <w:ind w:firstLine="850"/>
-        <w:jc w:val="left"/>
-        <w:rPr/>
-      </w:pPr>
-      <w:r>
-        <w:rPr/>
-      </w:r>
-    </w:p>
-    <w:p>
-      <w:pPr>
-        <w:pStyle w:val="Normal"/>
-        <w:bidi w:val="0"/>
-        <w:ind w:firstLine="850"/>
-        <w:jc w:val="left"/>
+        <w:jc w:val="both"/>
+        <w:rPr/>
+      </w:pPr>
+      <w:r>
+        <w:rPr/>
+      </w:r>
+    </w:p>
+    <w:p>
+      <w:pPr>
+        <w:pStyle w:val="Normal"/>
+        <w:bidi w:val="0"/>
+        <w:ind w:firstLine="850"/>
+        <w:jc w:val="both"/>
         <w:rPr/>
       </w:pPr>
       <w:r>
@@ -14434,7 +13996,7 @@
         <w:pStyle w:val="Normal"/>
         <w:bidi w:val="0"/>
         <w:ind w:firstLine="850"/>
-        <w:jc w:val="left"/>
+        <w:jc w:val="both"/>
         <w:rPr/>
       </w:pPr>
       <w:r>
@@ -14445,7 +14007,7 @@
     <w:p>
       <w:pPr>
         <w:pStyle w:val="Heading1"/>
-        <w:jc w:val="left"/>
+        <w:jc w:val="both"/>
         <w:rPr/>
       </w:pPr>
       <w:bookmarkStart w:id="51" w:name="__RefHeading___Toc1081_3284332197"/>
@@ -14460,7 +14022,7 @@
         <w:pStyle w:val="Normal"/>
         <w:bidi w:val="0"/>
         <w:ind w:firstLine="850"/>
-        <w:jc w:val="left"/>
+        <w:jc w:val="both"/>
         <w:rPr/>
       </w:pPr>
       <w:r>
@@ -14473,7 +14035,7 @@
         <w:pStyle w:val="Normal"/>
         <w:bidi w:val="0"/>
         <w:ind w:firstLine="850"/>
-        <w:jc w:val="left"/>
+        <w:jc w:val="both"/>
         <w:rPr/>
       </w:pPr>
       <w:r>
@@ -14486,7 +14048,7 @@
         <w:pStyle w:val="Normal"/>
         <w:bidi w:val="0"/>
         <w:ind w:firstLine="850"/>
-        <w:jc w:val="left"/>
+        <w:jc w:val="both"/>
         <w:rPr/>
       </w:pPr>
       <w:r>
@@ -14499,7 +14061,7 @@
         <w:pStyle w:val="Normal"/>
         <w:bidi w:val="0"/>
         <w:ind w:firstLine="850"/>
-        <w:jc w:val="left"/>
+        <w:jc w:val="both"/>
         <w:rPr/>
       </w:pPr>
       <w:r>
@@ -14512,7 +14074,7 @@
         <w:pStyle w:val="Normal"/>
         <w:bidi w:val="0"/>
         <w:ind w:firstLine="850"/>
-        <w:jc w:val="left"/>
+        <w:jc w:val="both"/>
         <w:rPr/>
       </w:pPr>
       <w:r>
@@ -14525,7 +14087,7 @@
         <w:pStyle w:val="Normal"/>
         <w:bidi w:val="0"/>
         <w:ind w:firstLine="850"/>
-        <w:jc w:val="left"/>
+        <w:jc w:val="both"/>
         <w:rPr/>
       </w:pPr>
       <w:r>
@@ -14538,7 +14100,7 @@
         <w:pStyle w:val="Normal"/>
         <w:bidi w:val="0"/>
         <w:ind w:firstLine="850"/>
-        <w:jc w:val="left"/>
+        <w:jc w:val="both"/>
         <w:rPr/>
       </w:pPr>
       <w:r>
@@ -14551,7 +14113,7 @@
         <w:pStyle w:val="Normal"/>
         <w:bidi w:val="0"/>
         <w:ind w:firstLine="850"/>
-        <w:jc w:val="left"/>
+        <w:jc w:val="both"/>
         <w:rPr/>
       </w:pPr>
       <w:r>
@@ -14564,7 +14126,7 @@
         <w:pStyle w:val="Normal"/>
         <w:bidi w:val="0"/>
         <w:ind w:firstLine="850"/>
-        <w:jc w:val="left"/>
+        <w:jc w:val="both"/>
         <w:rPr/>
       </w:pPr>
       <w:r>
@@ -14581,14 +14143,8 @@
         <w:bidi w:val="0"/>
         <w:spacing w:before="0" w:after="280"/>
         <w:ind w:hanging="0" w:left="0"/>
-        <w:jc w:val="left"/>
-        <w:rPr>
-          <w:rFonts w:ascii="Times New Roman" w:hAnsi="Times New Roman" w:cs="Times New Roman"/>
-          <w:b/>
-          <w:bCs/>
-          <w:szCs w:val="28"/>
-          <w:lang w:val="en-US"/>
-        </w:rPr>
+        <w:jc w:val="both"/>
+        <w:rPr/>
       </w:pPr>
       <w:bookmarkStart w:id="52" w:name="__RefHeading___Toc386_1229224459"/>
       <w:bookmarkStart w:id="53" w:name="_Toc24600"/>
@@ -14605,7 +14161,7 @@
       <w:pPr>
         <w:pStyle w:val="Normal"/>
         <w:spacing w:lineRule="auto" w:line="360"/>
-        <w:jc w:val="left"/>
+        <w:jc w:val="both"/>
         <w:rPr/>
       </w:pPr>
       <w:r>
@@ -14617,7 +14173,7 @@
       <w:pPr>
         <w:pStyle w:val="Normal"/>
         <w:spacing w:lineRule="auto" w:line="360"/>
-        <w:jc w:val="left"/>
+        <w:jc w:val="both"/>
         <w:rPr/>
       </w:pPr>
       <w:r>
@@ -14629,7 +14185,7 @@
       <w:pPr>
         <w:pStyle w:val="Normal"/>
         <w:spacing w:lineRule="auto" w:line="360"/>
-        <w:jc w:val="left"/>
+        <w:jc w:val="both"/>
         <w:rPr/>
       </w:pPr>
       <w:r>
@@ -14641,7 +14197,7 @@
       <w:pPr>
         <w:pStyle w:val="Normal"/>
         <w:spacing w:lineRule="auto" w:line="360"/>
-        <w:jc w:val="left"/>
+        <w:jc w:val="both"/>
         <w:rPr/>
       </w:pPr>
       <w:r>
@@ -14665,7 +14221,7 @@
       <w:pPr>
         <w:pStyle w:val="Normal"/>
         <w:spacing w:lineRule="auto" w:line="360"/>
-        <w:jc w:val="left"/>
+        <w:jc w:val="both"/>
         <w:rPr/>
       </w:pPr>
       <w:r>
@@ -14677,7 +14233,7 @@
       <w:pPr>
         <w:pStyle w:val="Normal"/>
         <w:spacing w:lineRule="auto" w:line="360"/>
-        <w:jc w:val="left"/>
+        <w:jc w:val="both"/>
         <w:rPr/>
       </w:pPr>
       <w:r>
@@ -14689,7 +14245,7 @@
       <w:pPr>
         <w:pStyle w:val="Normal"/>
         <w:spacing w:lineRule="auto" w:line="360"/>
-        <w:jc w:val="left"/>
+        <w:jc w:val="both"/>
         <w:rPr/>
       </w:pPr>
       <w:r>
@@ -14701,7 +14257,7 @@
       <w:pPr>
         <w:pStyle w:val="Normal"/>
         <w:spacing w:lineRule="auto" w:line="360"/>
-        <w:jc w:val="left"/>
+        <w:jc w:val="both"/>
         <w:rPr/>
       </w:pPr>
       <w:r>
@@ -14713,7 +14269,7 @@
       <w:pPr>
         <w:pStyle w:val="Normal"/>
         <w:spacing w:lineRule="auto" w:line="360"/>
-        <w:jc w:val="left"/>
+        <w:jc w:val="both"/>
         <w:rPr/>
       </w:pPr>
       <w:r>
@@ -14736,6 +14292,7 @@
     <w:p>
       <w:pPr>
         <w:pStyle w:val="Normal"/>
+        <w:jc w:val="both"/>
         <w:rPr/>
       </w:pPr>
       <w:r>
@@ -14775,6 +14332,7 @@
     <w:p>
       <w:pPr>
         <w:pStyle w:val="Normal"/>
+        <w:jc w:val="both"/>
         <w:rPr/>
       </w:pPr>
       <w:r>
@@ -14802,6 +14360,7 @@
     <w:p>
       <w:pPr>
         <w:pStyle w:val="Normal"/>
+        <w:jc w:val="both"/>
         <w:rPr/>
       </w:pPr>
       <w:r>
@@ -14829,6 +14388,7 @@
     <w:p>
       <w:pPr>
         <w:pStyle w:val="Normal"/>
+        <w:jc w:val="both"/>
         <w:rPr/>
       </w:pPr>
       <w:r>
@@ -14856,6 +14416,7 @@
     <w:p>
       <w:pPr>
         <w:pStyle w:val="Normal"/>
+        <w:jc w:val="both"/>
         <w:rPr/>
       </w:pPr>
       <w:r>
@@ -14883,6 +14444,7 @@
     <w:p>
       <w:pPr>
         <w:pStyle w:val="Normal"/>
+        <w:jc w:val="both"/>
         <w:rPr/>
       </w:pPr>
       <w:r>
@@ -14910,6 +14472,7 @@
     <w:p>
       <w:pPr>
         <w:pStyle w:val="Normal"/>
+        <w:jc w:val="both"/>
         <w:rPr/>
       </w:pPr>
       <w:r>
@@ -14937,6 +14500,7 @@
     <w:p>
       <w:pPr>
         <w:pStyle w:val="Normal"/>
+        <w:jc w:val="both"/>
         <w:rPr/>
       </w:pPr>
       <w:r>
@@ -14964,6 +14528,7 @@
     <w:p>
       <w:pPr>
         <w:pStyle w:val="Normal"/>
+        <w:jc w:val="both"/>
         <w:rPr/>
       </w:pPr>
       <w:r>
@@ -14991,6 +14556,7 @@
     <w:p>
       <w:pPr>
         <w:pStyle w:val="Normal"/>
+        <w:jc w:val="both"/>
         <w:rPr/>
       </w:pPr>
       <w:r>
@@ -15021,10 +14587,8 @@
         <w:bidi w:val="0"/>
         <w:spacing w:before="280" w:after="280"/>
         <w:ind w:hanging="0" w:left="0"/>
-        <w:jc w:val="left"/>
-        <w:rPr>
-          <w:lang w:val="en-US"/>
-        </w:rPr>
+        <w:jc w:val="both"/>
+        <w:rPr/>
       </w:pPr>
       <w:bookmarkStart w:id="54" w:name="__RefHeading___Toc388_1229224459"/>
       <w:bookmarkStart w:id="55" w:name="_Toc4865"/>
@@ -15045,9 +14609,8 @@
           <w:numId w:val="1"/>
         </w:numPr>
         <w:spacing w:before="120" w:after="120"/>
-        <w:rPr>
-          <w:lang w:val="en-US"/>
-        </w:rPr>
+        <w:jc w:val="both"/>
+        <w:rPr/>
       </w:pPr>
       <w:r>
         <w:rPr>
@@ -15178,7 +14741,7 @@
                             <w:rPr>
                               <w:color w:val="000000"/>
                             </w:rPr>
-                            <w:t>4</w:t>
+                            <w:t>1</w:t>
                           </w:r>
                           <w:r>
                             <w:rPr>
@@ -15235,7 +14798,7 @@
                       <w:rPr>
                         <w:color w:val="000000"/>
                       </w:rPr>
-                      <w:t>4</w:t>
+                      <w:t>1</w:t>
                     </w:r>
                     <w:r>
                       <w:rPr>
@@ -15338,7 +14901,7 @@
                             <w:rPr>
                               <w:color w:val="000000"/>
                             </w:rPr>
-                            <w:t>4</w:t>
+                            <w:t>1</w:t>
                           </w:r>
                           <w:r>
                             <w:rPr>
@@ -15395,7 +14958,7 @@
                       <w:rPr>
                         <w:color w:val="000000"/>
                       </w:rPr>
-                      <w:t>4</w:t>
+                      <w:t>1</w:t>
                     </w:r>
                     <w:r>
                       <w:rPr>

</xml_diff>